<commit_message>
Update on 02 Jul 2025 at 14:54
</commit_message>
<xml_diff>
--- a/01_general.docx
+++ b/01_general.docx
@@ -268,9 +268,13 @@
         <w:r>
           <w:fldChar w:fldCharType="begin"/>
         </w:r>
+      </w:ins>
+      <w:ins w:id="17" w:author="Pawel KAMINSKI" w:date="2025-07-02T16:52:00Z" w16du:dateUtc="2025-07-02T14:52:00Z">
         <w:r>
           <w:instrText>HYPERLINK "mailto:tnb.admin@uni.lu"</w:instrText>
         </w:r>
+      </w:ins>
+      <w:ins w:id="18" w:author="Pawel KAMINSKI" w:date="2024-06-18T11:02:00Z">
         <w:r>
           <w:fldChar w:fldCharType="separate"/>
         </w:r>
@@ -287,7 +291,7 @@
           <w:t>.</w:t>
         </w:r>
       </w:ins>
-      <w:del w:id="17" w:author="Pawel KAMINSKI" w:date="2024-06-03T17:02:00Z">
+      <w:del w:id="19" w:author="Pawel KAMINSKI" w:date="2024-06-03T17:02:00Z">
         <w:r>
           <w:delText>n</w:delText>
         </w:r>
@@ -300,7 +304,7 @@
       <w:pPr>
         <w:pStyle w:val="BodyText"/>
       </w:pPr>
-      <w:del w:id="18" w:author="Pawel KAMINSKI" w:date="2024-06-03T17:02:00Z">
+      <w:del w:id="20" w:author="Pawel KAMINSKI" w:date="2024-06-03T17:02:00Z">
         <w:r>
           <w:delText xml:space="preserve">:::{card} TODO </w:delText>
         </w:r>
@@ -313,24 +317,24 @@
         <w:r>
           <w:br/>
         </w:r>
-        <w:commentRangeStart w:id="19"/>
-        <w:commentRangeStart w:id="20"/>
+        <w:commentRangeStart w:id="21"/>
+        <w:commentRangeStart w:id="22"/>
         <w:r>
           <w:delText>Add manuscript template</w:delText>
         </w:r>
-        <w:commentRangeEnd w:id="19"/>
+        <w:commentRangeEnd w:id="21"/>
         <w:r>
           <w:rPr>
             <w:rStyle w:val="CommentReference"/>
           </w:rPr>
-          <w:commentReference w:id="19"/>
-        </w:r>
-        <w:commentRangeEnd w:id="20"/>
+          <w:commentReference w:id="21"/>
+        </w:r>
+        <w:commentRangeEnd w:id="22"/>
         <w:r>
           <w:rPr>
             <w:rStyle w:val="CommentReference"/>
           </w:rPr>
-          <w:commentReference w:id="20"/>
+          <w:commentReference w:id="22"/>
         </w:r>
         <w:r>
           <w:br/>
@@ -341,25 +345,25 @@
     <w:p>
       <w:pPr>
         <w:pStyle w:val="Heading2"/>
-        <w:pPrChange w:id="22" w:author="Pawel KAMINSKI" w:date="2024-06-03T12:38:00Z">
+        <w:pPrChange w:id="24" w:author="Pawel KAMINSKI" w:date="2024-06-03T12:38:00Z">
           <w:pPr>
             <w:pStyle w:val="Heading1"/>
           </w:pPr>
         </w:pPrChange>
       </w:pPr>
-      <w:commentRangeStart w:id="23"/>
-      <w:commentRangeStart w:id="24"/>
-      <w:del w:id="25" w:author="Pawel KAMINSKI" w:date="2025-01-06T11:12:00Z">
+      <w:commentRangeStart w:id="25"/>
+      <w:commentRangeStart w:id="26"/>
+      <w:del w:id="27" w:author="Pawel KAMINSKI" w:date="2025-01-06T11:12:00Z">
         <w:r>
           <w:delText xml:space="preserve">Manuscript </w:delText>
         </w:r>
       </w:del>
-      <w:ins w:id="26" w:author="Pawel KAMINSKI" w:date="2025-01-06T11:12:00Z">
+      <w:ins w:id="28" w:author="Pawel KAMINSKI" w:date="2025-01-06T11:12:00Z">
         <w:r>
           <w:t xml:space="preserve">First </w:t>
         </w:r>
       </w:ins>
-      <w:ins w:id="27" w:author="Pawel KAMINSKI" w:date="2025-01-06T11:50:00Z">
+      <w:ins w:id="29" w:author="Pawel KAMINSKI" w:date="2025-01-06T11:50:00Z">
         <w:r>
           <w:t xml:space="preserve">Draft </w:t>
         </w:r>
@@ -367,19 +371,19 @@
       <w:r>
         <w:t>Submission</w:t>
       </w:r>
-      <w:commentRangeEnd w:id="23"/>
+      <w:commentRangeEnd w:id="25"/>
       <w:r>
         <w:rPr>
           <w:rStyle w:val="CommentReference"/>
         </w:rPr>
-        <w:commentReference w:id="23"/>
-      </w:r>
-      <w:commentRangeEnd w:id="24"/>
+        <w:commentReference w:id="25"/>
+      </w:r>
+      <w:commentRangeEnd w:id="26"/>
       <w:r>
         <w:rPr>
           <w:rStyle w:val="CommentReference"/>
         </w:rPr>
-        <w:commentReference w:id="24"/>
+        <w:commentReference w:id="26"/>
       </w:r>
     </w:p>
     <w:p>
@@ -387,25 +391,25 @@
         <w:pStyle w:val="BodyText"/>
         <w:jc w:val="both"/>
         <w:rPr>
-          <w:ins w:id="29" w:author="Pawel KAMINSKI" w:date="2024-06-03T14:31:00Z"/>
-        </w:rPr>
-      </w:pPr>
-      <w:ins w:id="30" w:author="Pawel KAMINSKI" w:date="2025-01-06T11:12:00Z">
+          <w:ins w:id="31" w:author="Pawel KAMINSKI" w:date="2024-06-03T14:31:00Z"/>
+        </w:rPr>
+      </w:pPr>
+      <w:ins w:id="32" w:author="Pawel KAMINSKI" w:date="2025-01-06T11:12:00Z">
         <w:r>
           <w:t>When sending</w:t>
         </w:r>
       </w:ins>
-      <w:ins w:id="31" w:author="Pawel KAMINSKI" w:date="2024-06-03T14:34:00Z">
+      <w:ins w:id="33" w:author="Pawel KAMINSKI" w:date="2024-06-03T14:34:00Z">
         <w:r>
           <w:t xml:space="preserve"> your manuscript</w:t>
         </w:r>
       </w:ins>
-      <w:ins w:id="32" w:author="Pawel KAMINSKI" w:date="2025-01-06T11:12:00Z">
+      <w:ins w:id="34" w:author="Pawel KAMINSKI" w:date="2025-01-06T11:12:00Z">
         <w:r>
           <w:t xml:space="preserve"> for the first time, please follow this procedure</w:t>
         </w:r>
       </w:ins>
-      <w:ins w:id="33" w:author="Pawel KAMINSKI" w:date="2024-06-03T14:31:00Z">
+      <w:ins w:id="35" w:author="Pawel KAMINSKI" w:date="2024-06-03T14:31:00Z">
         <w:r>
           <w:t>:</w:t>
         </w:r>
@@ -420,10 +424,10 @@
         </w:numPr>
         <w:jc w:val="both"/>
         <w:rPr>
-          <w:ins w:id="34" w:author="Pawel KAMINSKI" w:date="2024-06-18T11:03:00Z"/>
-        </w:rPr>
-      </w:pPr>
-      <w:ins w:id="35" w:author="Pawel KAMINSKI" w:date="2024-06-18T11:03:00Z">
+          <w:ins w:id="36" w:author="Pawel KAMINSKI" w:date="2024-06-18T11:03:00Z"/>
+        </w:rPr>
+      </w:pPr>
+      <w:ins w:id="37" w:author="Pawel KAMINSKI" w:date="2024-06-18T11:03:00Z">
         <w:r>
           <w:t xml:space="preserve">Send an email to </w:t>
         </w:r>
@@ -465,10 +469,10 @@
         </w:numPr>
         <w:jc w:val="both"/>
         <w:rPr>
-          <w:ins w:id="36" w:author="Pawel KAMINSKI" w:date="2024-06-18T11:03:00Z"/>
-        </w:rPr>
-      </w:pPr>
-      <w:ins w:id="37" w:author="Pawel KAMINSKI" w:date="2024-06-18T11:03:00Z">
+          <w:ins w:id="38" w:author="Pawel KAMINSKI" w:date="2024-06-18T11:03:00Z"/>
+        </w:rPr>
+      </w:pPr>
+      <w:ins w:id="39" w:author="Pawel KAMINSKI" w:date="2024-06-18T11:03:00Z">
         <w:r>
           <w:t>title of the book,</w:t>
         </w:r>
@@ -483,10 +487,10 @@
         </w:numPr>
         <w:jc w:val="both"/>
         <w:rPr>
-          <w:ins w:id="38" w:author="Pawel KAMINSKI" w:date="2024-06-18T11:03:00Z"/>
-        </w:rPr>
-      </w:pPr>
-      <w:ins w:id="39" w:author="Pawel KAMINSKI" w:date="2024-06-18T11:03:00Z">
+          <w:ins w:id="40" w:author="Pawel KAMINSKI" w:date="2024-06-18T11:03:00Z"/>
+        </w:rPr>
+      </w:pPr>
+      <w:ins w:id="41" w:author="Pawel KAMINSKI" w:date="2024-06-18T11:03:00Z">
         <w:r>
           <w:t>list of authors,</w:t>
         </w:r>
@@ -501,10 +505,10 @@
         </w:numPr>
         <w:jc w:val="both"/>
         <w:rPr>
-          <w:ins w:id="40" w:author="Pawel KAMINSKI" w:date="2024-06-18T11:03:00Z"/>
-        </w:rPr>
-      </w:pPr>
-      <w:ins w:id="41" w:author="Pawel KAMINSKI" w:date="2024-06-18T11:03:00Z">
+          <w:ins w:id="42" w:author="Pawel KAMINSKI" w:date="2024-06-18T11:03:00Z"/>
+        </w:rPr>
+      </w:pPr>
+      <w:ins w:id="43" w:author="Pawel KAMINSKI" w:date="2024-06-18T11:03:00Z">
         <w:r>
           <w:t>short description (optional),</w:t>
         </w:r>
@@ -519,10 +523,10 @@
         </w:numPr>
         <w:jc w:val="both"/>
         <w:rPr>
-          <w:ins w:id="42" w:author="Pawel KAMINSKI" w:date="2024-06-18T11:03:00Z"/>
-        </w:rPr>
-      </w:pPr>
-      <w:ins w:id="43" w:author="Pawel KAMINSKI" w:date="2024-06-18T11:03:00Z">
+          <w:ins w:id="44" w:author="Pawel KAMINSKI" w:date="2024-06-18T11:03:00Z"/>
+        </w:rPr>
+      </w:pPr>
+      <w:ins w:id="45" w:author="Pawel KAMINSKI" w:date="2024-06-18T11:03:00Z">
         <w:r>
           <w:t>slug proposal (unique identifier which will appear in the book URL),</w:t>
         </w:r>
@@ -537,10 +541,10 @@
         </w:numPr>
         <w:jc w:val="both"/>
         <w:rPr>
-          <w:ins w:id="44" w:author="Pawel KAMINSKI" w:date="2024-06-18T11:03:00Z"/>
-        </w:rPr>
-      </w:pPr>
-      <w:ins w:id="45" w:author="Pawel KAMINSKI" w:date="2024-06-18T11:03:00Z">
+          <w:ins w:id="46" w:author="Pawel KAMINSKI" w:date="2024-06-18T11:03:00Z"/>
+        </w:rPr>
+      </w:pPr>
+      <w:ins w:id="47" w:author="Pawel KAMINSKI" w:date="2024-06-18T11:03:00Z">
         <w:r>
           <w:t>list of files sorted by order in which they should appear in the book.</w:t>
         </w:r>
@@ -555,10 +559,10 @@
         </w:numPr>
         <w:jc w:val="both"/>
         <w:rPr>
-          <w:ins w:id="46" w:author="Pawel KAMINSKI" w:date="2024-06-18T11:03:00Z"/>
-        </w:rPr>
-      </w:pPr>
-      <w:ins w:id="47" w:author="Pawel KAMINSKI" w:date="2024-06-18T11:03:00Z">
+          <w:ins w:id="48" w:author="Pawel KAMINSKI" w:date="2024-06-18T11:03:00Z"/>
+        </w:rPr>
+      </w:pPr>
+      <w:ins w:id="49" w:author="Pawel KAMINSKI" w:date="2024-06-18T11:03:00Z">
         <w:r>
           <w:t>Add all relevant files of the manuscript a</w:t>
         </w:r>
@@ -590,10 +594,10 @@
         </w:numPr>
         <w:jc w:val="both"/>
         <w:rPr>
-          <w:ins w:id="48" w:author="Pawel KAMINSKI" w:date="2024-06-18T11:03:00Z"/>
-        </w:rPr>
-      </w:pPr>
-      <w:ins w:id="49" w:author="Pawel KAMINSKI" w:date="2024-06-18T11:03:00Z">
+          <w:ins w:id="50" w:author="Pawel KAMINSKI" w:date="2024-06-18T11:03:00Z"/>
+        </w:rPr>
+      </w:pPr>
+      <w:ins w:id="51" w:author="Pawel KAMINSKI" w:date="2024-06-18T11:03:00Z">
         <w:r>
           <w:t xml:space="preserve">You will be contacted by someone from the </w:t>
         </w:r>
@@ -602,7 +606,7 @@
           <w:rPr>
             <w:i/>
             <w:iCs/>
-            <w:rPrChange w:id="50" w:author="Pawel KAMINSKI" w:date="2024-06-18T11:03:00Z">
+            <w:rPrChange w:id="52" w:author="Pawel KAMINSKI" w:date="2024-06-18T11:03:00Z">
               <w:rPr/>
             </w:rPrChange>
           </w:rPr>
@@ -618,65 +622,70 @@
       <w:pPr>
         <w:pStyle w:val="BodyText"/>
         <w:rPr>
-          <w:ins w:id="51" w:author="Pawel KAMINSKI" w:date="2025-01-06T11:13:00Z"/>
+          <w:ins w:id="53" w:author="Pawel KAMINSKI" w:date="2025-01-06T11:13:00Z"/>
         </w:rPr>
       </w:pPr>
     </w:p>
     <w:p>
       <w:pPr>
         <w:pStyle w:val="BodyText"/>
-        <w:rPr>
-          <w:ins w:id="52" w:author="Pawel KAMINSKI" w:date="2025-01-06T11:13:00Z"/>
-        </w:rPr>
-      </w:pPr>
-      <w:ins w:id="53" w:author="Pawel KAMINSKI" w:date="2025-01-06T11:13:00Z">
-        <w:r>
-          <w:lastRenderedPageBreak/>
+        <w:jc w:val="both"/>
+        <w:rPr>
+          <w:ins w:id="54" w:author="Pawel KAMINSKI" w:date="2025-01-06T11:13:00Z"/>
+        </w:rPr>
+        <w:pPrChange w:id="55" w:author="Pawel KAMINSKI" w:date="2025-07-02T16:53:00Z" w16du:dateUtc="2025-07-02T14:53:00Z">
+          <w:pPr>
+            <w:pStyle w:val="BodyText"/>
+          </w:pPr>
+        </w:pPrChange>
+      </w:pPr>
+      <w:ins w:id="56" w:author="Pawel KAMINSKI" w:date="2025-01-06T11:13:00Z">
+        <w:r>
           <w:t>:::{</w:t>
         </w:r>
       </w:ins>
-      <w:ins w:id="54" w:author="Pawel KAMINSKI" w:date="2025-01-06T11:14:00Z">
+      <w:ins w:id="57" w:author="Pawel KAMINSKI" w:date="2025-01-06T11:14:00Z">
         <w:r>
           <w:t>note</w:t>
         </w:r>
       </w:ins>
-      <w:ins w:id="55" w:author="Pawel KAMINSKI" w:date="2025-01-06T11:13:00Z">
+      <w:ins w:id="58" w:author="Pawel KAMINSKI" w:date="2025-01-06T11:13:00Z">
         <w:r>
           <w:t>}</w:t>
         </w:r>
       </w:ins>
-      <w:ins w:id="56" w:author="Pawel KAMINSKI" w:date="2025-01-06T11:15:00Z">
+      <w:ins w:id="59" w:author="Pawel KAMINSKI" w:date="2025-01-06T11:15:00Z">
         <w:r>
           <w:br/>
           <w:t>When submitting your manuscript for the first time do</w:t>
         </w:r>
       </w:ins>
-      <w:ins w:id="57" w:author="Pawel KAMINSKI" w:date="2025-01-06T11:16:00Z">
+      <w:ins w:id="60" w:author="Pawel KAMINSKI" w:date="2025-01-06T11:16:00Z">
         <w:r>
           <w:t xml:space="preserve"> </w:t>
         </w:r>
       </w:ins>
-      <w:ins w:id="58" w:author="Pawel KAMINSKI" w:date="2025-01-06T11:15:00Z">
+      <w:ins w:id="61" w:author="Pawel KAMINSKI" w:date="2025-01-06T11:15:00Z">
         <w:r>
           <w:t>n</w:t>
         </w:r>
       </w:ins>
-      <w:ins w:id="59" w:author="Pawel KAMINSKI" w:date="2025-01-06T11:16:00Z">
+      <w:ins w:id="62" w:author="Pawel KAMINSKI" w:date="2025-01-06T11:16:00Z">
         <w:r>
           <w:t>o</w:t>
         </w:r>
       </w:ins>
-      <w:ins w:id="60" w:author="Pawel KAMINSKI" w:date="2025-01-06T11:15:00Z">
+      <w:ins w:id="63" w:author="Pawel KAMINSKI" w:date="2025-01-06T11:15:00Z">
         <w:r>
           <w:t>t worry that it is not prefect</w:t>
         </w:r>
       </w:ins>
-      <w:ins w:id="61" w:author="Pawel KAMINSKI" w:date="2025-01-06T11:13:00Z">
+      <w:ins w:id="64" w:author="Pawel KAMINSKI" w:date="2025-01-06T11:13:00Z">
         <w:r>
           <w:t>.</w:t>
         </w:r>
       </w:ins>
-      <w:ins w:id="62" w:author="Pawel KAMINSKI" w:date="2025-01-06T11:15:00Z">
+      <w:ins w:id="65" w:author="Pawel KAMINSKI" w:date="2025-01-06T11:15:00Z">
         <w:r>
           <w:t xml:space="preserve"> </w:t>
         </w:r>
@@ -684,12 +693,12 @@
           <w:t xml:space="preserve">You will be able to change it </w:t>
         </w:r>
       </w:ins>
-      <w:ins w:id="63" w:author="Pawel KAMINSKI" w:date="2025-01-06T11:16:00Z">
+      <w:ins w:id="66" w:author="Pawel KAMINSKI" w:date="2025-01-06T11:16:00Z">
         <w:r>
           <w:t>to comply with the guidelines and to make sure it looks the way you want it to.</w:t>
         </w:r>
       </w:ins>
-      <w:ins w:id="64" w:author="Pawel KAMINSKI" w:date="2025-01-06T11:17:00Z">
+      <w:ins w:id="67" w:author="Pawel KAMINSKI" w:date="2025-01-06T11:17:00Z">
         <w:r>
           <w:t xml:space="preserve"> The only </w:t>
         </w:r>
@@ -697,7 +706,7 @@
           <w:t xml:space="preserve">thing that will be difficult to </w:t>
         </w:r>
       </w:ins>
-      <w:ins w:id="65" w:author="Pawel KAMINSKI" w:date="2025-01-06T11:18:00Z">
+      <w:ins w:id="68" w:author="Pawel KAMINSKI" w:date="2025-01-06T11:18:00Z">
         <w:r>
           <w:t xml:space="preserve">change is its </w:t>
         </w:r>
@@ -711,12 +720,12 @@
           <w:t>–</w:t>
         </w:r>
       </w:ins>
-      <w:ins w:id="66" w:author="Pawel KAMINSKI" w:date="2025-01-06T11:19:00Z">
+      <w:ins w:id="69" w:author="Pawel KAMINSKI" w:date="2025-01-06T11:19:00Z">
         <w:r>
           <w:t xml:space="preserve"> how it is divided into separate files and how the files are </w:t>
         </w:r>
       </w:ins>
-      <w:ins w:id="67" w:author="Pawel KAMINSKI" w:date="2025-01-06T11:20:00Z">
+      <w:ins w:id="70" w:author="Pawel KAMINSKI" w:date="2025-01-06T11:20:00Z">
         <w:r>
           <w:t xml:space="preserve">named. </w:t>
         </w:r>
@@ -724,7 +733,7 @@
           <w:rPr>
             <w:b/>
             <w:bCs/>
-            <w:rPrChange w:id="68" w:author="Pawel KAMINSKI" w:date="2025-01-06T11:20:00Z">
+            <w:rPrChange w:id="71" w:author="Pawel KAMINSKI" w:date="2025-01-06T11:20:00Z">
               <w:rPr/>
             </w:rPrChange>
           </w:rPr>
@@ -737,17 +746,17 @@
           <w:t xml:space="preserve"> Everything else you will b</w:t>
         </w:r>
       </w:ins>
-      <w:ins w:id="69" w:author="Pawel KAMINSKI" w:date="2025-01-06T11:21:00Z">
+      <w:ins w:id="72" w:author="Pawel KAMINSKI" w:date="2025-01-06T11:21:00Z">
         <w:r>
           <w:t>e able to modify later.</w:t>
         </w:r>
       </w:ins>
-      <w:ins w:id="70" w:author="Pawel KAMINSKI" w:date="2025-01-06T11:19:00Z">
+      <w:ins w:id="73" w:author="Pawel KAMINSKI" w:date="2025-01-06T11:19:00Z">
         <w:r>
           <w:br/>
         </w:r>
       </w:ins>
-      <w:ins w:id="71" w:author="Pawel KAMINSKI" w:date="2025-01-06T11:13:00Z">
+      <w:ins w:id="74" w:author="Pawel KAMINSKI" w:date="2025-01-06T11:13:00Z">
         <w:r>
           <w:t>:::</w:t>
         </w:r>
@@ -757,10 +766,10 @@
       <w:pPr>
         <w:pStyle w:val="BodyText"/>
         <w:rPr>
-          <w:del w:id="72" w:author="Pawel KAMINSKI" w:date="2024-06-03T15:04:00Z"/>
-        </w:rPr>
-      </w:pPr>
-      <w:del w:id="73" w:author="Pawel KAMINSKI" w:date="2024-06-03T15:04:00Z">
+          <w:del w:id="75" w:author="Pawel KAMINSKI" w:date="2024-06-03T15:04:00Z"/>
+        </w:rPr>
+      </w:pPr>
+      <w:del w:id="76" w:author="Pawel KAMINSKI" w:date="2024-06-03T15:04:00Z">
         <w:r>
           <w:delText xml:space="preserve">:::{card} TODO </w:delText>
         </w:r>
@@ -782,8 +791,8 @@
         <w:r>
           <w:delText>he</w:delText>
         </w:r>
-        <w:commentRangeStart w:id="74"/>
-        <w:commentRangeStart w:id="75"/>
+        <w:commentRangeStart w:id="77"/>
+        <w:commentRangeStart w:id="78"/>
         <w:r>
           <w:delText xml:space="preserve">n there is </w:delText>
         </w:r>
@@ -802,22 +811,22 @@
         <w:r>
           <w:delText>infrastructure.</w:delText>
         </w:r>
-        <w:commentRangeEnd w:id="74"/>
+        <w:commentRangeEnd w:id="77"/>
         <w:r>
           <w:rPr>
             <w:rStyle w:val="CommentReference"/>
           </w:rPr>
-          <w:commentReference w:id="74"/>
+          <w:commentReference w:id="77"/>
         </w:r>
       </w:del>
-      <w:commentRangeEnd w:id="75"/>
+      <w:commentRangeEnd w:id="78"/>
       <w:r>
         <w:rPr>
           <w:rStyle w:val="CommentReference"/>
         </w:rPr>
-        <w:commentReference w:id="75"/>
-      </w:r>
-      <w:del w:id="77" w:author="Pawel KAMINSKI" w:date="2024-06-03T15:04:00Z">
+        <w:commentReference w:id="78"/>
+      </w:r>
+      <w:del w:id="80" w:author="Pawel KAMINSKI" w:date="2024-06-03T15:04:00Z">
         <w:r>
           <w:br/>
           <w:delText>:::</w:delText>
@@ -828,7 +837,7 @@
       <w:pPr>
         <w:pStyle w:val="BodyText"/>
         <w:rPr>
-          <w:ins w:id="78" w:author="Pawel KAMINSKI" w:date="2025-01-06T11:12:00Z"/>
+          <w:ins w:id="81" w:author="Pawel KAMINSKI" w:date="2025-01-06T11:12:00Z"/>
         </w:rPr>
       </w:pPr>
     </w:p>
@@ -836,15 +845,15 @@
       <w:pPr>
         <w:pStyle w:val="Heading2"/>
         <w:rPr>
-          <w:ins w:id="79" w:author="Pawel KAMINSKI" w:date="2025-01-06T11:12:00Z"/>
-        </w:rPr>
-        <w:pPrChange w:id="80" w:author="Pawel KAMINSKI" w:date="2025-01-06T11:13:00Z">
+          <w:ins w:id="82" w:author="Pawel KAMINSKI" w:date="2025-01-06T11:12:00Z"/>
+        </w:rPr>
+        <w:pPrChange w:id="83" w:author="Pawel KAMINSKI" w:date="2025-01-06T11:13:00Z">
           <w:pPr>
             <w:pStyle w:val="BodyText"/>
           </w:pPr>
         </w:pPrChange>
       </w:pPr>
-      <w:ins w:id="81" w:author="Pawel KAMINSKI" w:date="2025-01-06T11:25:00Z">
+      <w:ins w:id="84" w:author="Pawel KAMINSKI" w:date="2025-01-06T11:25:00Z">
         <w:r>
           <w:t>Modification</w:t>
         </w:r>
@@ -852,27 +861,27 @@
           <w:t xml:space="preserve">s </w:t>
         </w:r>
       </w:ins>
-      <w:ins w:id="82" w:author="Pawel KAMINSKI" w:date="2025-01-06T11:50:00Z">
+      <w:ins w:id="85" w:author="Pawel KAMINSKI" w:date="2025-01-06T11:50:00Z">
         <w:r>
           <w:t>A</w:t>
         </w:r>
       </w:ins>
-      <w:ins w:id="83" w:author="Pawel KAMINSKI" w:date="2025-01-06T11:25:00Z">
+      <w:ins w:id="86" w:author="Pawel KAMINSKI" w:date="2025-01-06T11:25:00Z">
         <w:r>
           <w:t xml:space="preserve">fter </w:t>
         </w:r>
       </w:ins>
-      <w:ins w:id="84" w:author="Pawel KAMINSKI" w:date="2025-01-06T11:50:00Z">
+      <w:ins w:id="87" w:author="Pawel KAMINSKI" w:date="2025-01-06T11:50:00Z">
         <w:r>
           <w:t>F</w:t>
         </w:r>
       </w:ins>
-      <w:ins w:id="85" w:author="Pawel KAMINSKI" w:date="2025-01-06T11:25:00Z">
+      <w:ins w:id="88" w:author="Pawel KAMINSKI" w:date="2025-01-06T11:25:00Z">
         <w:r>
           <w:t xml:space="preserve">irst </w:t>
         </w:r>
       </w:ins>
-      <w:ins w:id="86" w:author="Pawel KAMINSKI" w:date="2025-01-06T11:50:00Z">
+      <w:ins w:id="89" w:author="Pawel KAMINSKI" w:date="2025-01-06T11:50:00Z">
         <w:r>
           <w:t xml:space="preserve">Draft </w:t>
         </w:r>
@@ -880,7 +889,7 @@
           <w:t>S</w:t>
         </w:r>
       </w:ins>
-      <w:ins w:id="87" w:author="Pawel KAMINSKI" w:date="2025-01-06T11:25:00Z">
+      <w:ins w:id="90" w:author="Pawel KAMINSKI" w:date="2025-01-06T11:25:00Z">
         <w:r>
           <w:t>ubmission</w:t>
         </w:r>
@@ -890,31 +899,31 @@
       <w:pPr>
         <w:pStyle w:val="BodyText"/>
         <w:rPr>
-          <w:ins w:id="88" w:author="Pawel KAMINSKI" w:date="2025-01-06T11:26:00Z"/>
-        </w:rPr>
-      </w:pPr>
-      <w:ins w:id="89" w:author="Pawel KAMINSKI" w:date="2025-01-06T11:29:00Z">
+          <w:ins w:id="91" w:author="Pawel KAMINSKI" w:date="2025-01-06T11:26:00Z"/>
+        </w:rPr>
+      </w:pPr>
+      <w:ins w:id="92" w:author="Pawel KAMINSKI" w:date="2025-01-06T11:29:00Z">
         <w:r>
           <w:t>As a general rule, a</w:t>
         </w:r>
       </w:ins>
-      <w:ins w:id="90" w:author="Pawel KAMINSKI" w:date="2025-01-06T11:21:00Z">
+      <w:ins w:id="93" w:author="Pawel KAMINSKI" w:date="2025-01-06T11:21:00Z">
         <w:r>
           <w:t xml:space="preserve">fter </w:t>
         </w:r>
       </w:ins>
-      <w:ins w:id="91" w:author="Pawel KAMINSKI" w:date="2025-01-06T11:24:00Z">
+      <w:ins w:id="94" w:author="Pawel KAMINSKI" w:date="2025-01-06T11:24:00Z">
         <w:r>
           <w:t xml:space="preserve">the first submission </w:t>
         </w:r>
       </w:ins>
-      <w:ins w:id="92" w:author="Pawel KAMINSKI" w:date="2025-01-06T11:29:00Z">
+      <w:ins w:id="95" w:author="Pawel KAMINSKI" w:date="2025-01-06T11:29:00Z">
         <w:r>
           <w:t xml:space="preserve">the </w:t>
         </w:r>
       </w:ins>
       <w:proofErr w:type="spellStart"/>
-      <w:ins w:id="93" w:author="Pawel KAMINSKI" w:date="2025-03-04T10:51:00Z" w16du:dateUtc="2025-03-04T09:51:00Z">
+      <w:ins w:id="96" w:author="Pawel KAMINSKI" w:date="2025-03-04T10:51:00Z" w16du:dateUtc="2025-03-04T09:51:00Z">
         <w:r>
           <w:rPr>
             <w:i/>
@@ -927,12 +936,12 @@
           <w:t xml:space="preserve"> </w:t>
         </w:r>
       </w:ins>
-      <w:ins w:id="94" w:author="Pawel KAMINSKI" w:date="2025-01-06T11:29:00Z">
+      <w:ins w:id="97" w:author="Pawel KAMINSKI" w:date="2025-01-06T11:29:00Z">
         <w:r>
           <w:t>team will provide you with</w:t>
         </w:r>
       </w:ins>
-      <w:ins w:id="95" w:author="Pawel KAMINSKI" w:date="2025-01-06T11:26:00Z">
+      <w:ins w:id="98" w:author="Pawel KAMINSKI" w:date="2025-01-06T11:26:00Z">
         <w:r>
           <w:t>:</w:t>
         </w:r>
@@ -946,20 +955,20 @@
           <w:numId w:val="41"/>
         </w:numPr>
         <w:rPr>
-          <w:ins w:id="96" w:author="Pawel KAMINSKI" w:date="2025-01-06T11:26:00Z"/>
-        </w:rPr>
-      </w:pPr>
-      <w:ins w:id="97" w:author="Pawel KAMINSKI" w:date="2025-01-06T11:46:00Z">
+          <w:ins w:id="99" w:author="Pawel KAMINSKI" w:date="2025-01-06T11:26:00Z"/>
+        </w:rPr>
+      </w:pPr>
+      <w:ins w:id="100" w:author="Pawel KAMINSKI" w:date="2025-01-06T11:46:00Z">
         <w:r>
           <w:t>Central s</w:t>
         </w:r>
       </w:ins>
-      <w:ins w:id="98" w:author="Pawel KAMINSKI" w:date="2025-01-06T11:26:00Z">
+      <w:ins w:id="101" w:author="Pawel KAMINSKI" w:date="2025-01-06T11:26:00Z">
         <w:r>
           <w:t xml:space="preserve">torage location </w:t>
         </w:r>
       </w:ins>
-      <w:ins w:id="99" w:author="Pawel KAMINSKI" w:date="2025-01-06T11:27:00Z">
+      <w:ins w:id="102" w:author="Pawel KAMINSKI" w:date="2025-01-06T11:27:00Z">
         <w:r>
           <w:t xml:space="preserve">of </w:t>
         </w:r>
@@ -976,10 +985,10 @@
           <w:numId w:val="41"/>
         </w:numPr>
         <w:rPr>
-          <w:ins w:id="100" w:author="Pawel KAMINSKI" w:date="2025-01-06T11:28:00Z"/>
-        </w:rPr>
-      </w:pPr>
-      <w:ins w:id="101" w:author="Pawel KAMINSKI" w:date="2025-01-06T11:27:00Z">
+          <w:ins w:id="103" w:author="Pawel KAMINSKI" w:date="2025-01-06T11:28:00Z"/>
+        </w:rPr>
+      </w:pPr>
+      <w:ins w:id="104" w:author="Pawel KAMINSKI" w:date="2025-01-06T11:27:00Z">
         <w:r>
           <w:t xml:space="preserve">Link to a dashboard displaying useful information about </w:t>
         </w:r>
@@ -987,7 +996,7 @@
           <w:t xml:space="preserve">your </w:t>
         </w:r>
       </w:ins>
-      <w:ins w:id="102" w:author="Pawel KAMINSKI" w:date="2025-01-06T11:28:00Z">
+      <w:ins w:id="105" w:author="Pawel KAMINSKI" w:date="2025-01-06T11:28:00Z">
         <w:r>
           <w:t>manuscript,</w:t>
         </w:r>
@@ -1001,15 +1010,15 @@
           <w:numId w:val="41"/>
         </w:numPr>
         <w:rPr>
-          <w:ins w:id="103" w:author="Pawel KAMINSKI" w:date="2025-01-06T11:26:00Z"/>
-        </w:rPr>
-        <w:pPrChange w:id="104" w:author="Pawel KAMINSKI" w:date="2025-01-06T11:26:00Z">
+          <w:ins w:id="106" w:author="Pawel KAMINSKI" w:date="2025-01-06T11:26:00Z"/>
+        </w:rPr>
+        <w:pPrChange w:id="107" w:author="Pawel KAMINSKI" w:date="2025-01-06T11:26:00Z">
           <w:pPr>
             <w:pStyle w:val="BodyText"/>
           </w:pPr>
         </w:pPrChange>
       </w:pPr>
-      <w:ins w:id="105" w:author="Pawel KAMINSKI" w:date="2025-01-06T11:28:00Z">
+      <w:ins w:id="108" w:author="Pawel KAMINSKI" w:date="2025-01-06T11:28:00Z">
         <w:r>
           <w:t xml:space="preserve">Link to a </w:t>
         </w:r>
@@ -1017,12 +1026,12 @@
           <w:t xml:space="preserve">digital version of your </w:t>
         </w:r>
       </w:ins>
-      <w:ins w:id="106" w:author="Pawel KAMINSKI" w:date="2025-01-06T11:29:00Z">
+      <w:ins w:id="109" w:author="Pawel KAMINSKI" w:date="2025-01-06T11:29:00Z">
         <w:r>
           <w:t>publication</w:t>
         </w:r>
       </w:ins>
-      <w:ins w:id="107" w:author="Pawel KAMINSKI" w:date="2025-01-06T11:28:00Z">
+      <w:ins w:id="110" w:author="Pawel KAMINSKI" w:date="2025-01-06T11:28:00Z">
         <w:r>
           <w:t>.</w:t>
         </w:r>
@@ -1032,7 +1041,7 @@
       <w:pPr>
         <w:pStyle w:val="BodyText"/>
         <w:rPr>
-          <w:ins w:id="108" w:author="Pawel KAMINSKI" w:date="2025-01-06T11:47:00Z"/>
+          <w:ins w:id="111" w:author="Pawel KAMINSKI" w:date="2025-01-06T11:47:00Z"/>
         </w:rPr>
       </w:pPr>
     </w:p>
@@ -1040,10 +1049,10 @@
       <w:pPr>
         <w:pStyle w:val="BodyText"/>
         <w:rPr>
-          <w:ins w:id="109" w:author="Pawel KAMINSKI" w:date="2025-01-06T11:47:00Z"/>
-        </w:rPr>
-      </w:pPr>
-      <w:ins w:id="110" w:author="Pawel KAMINSKI" w:date="2025-01-06T11:47:00Z">
+          <w:ins w:id="112" w:author="Pawel KAMINSKI" w:date="2025-01-06T11:47:00Z"/>
+        </w:rPr>
+      </w:pPr>
+      <w:ins w:id="113" w:author="Pawel KAMINSKI" w:date="2025-01-06T11:47:00Z">
         <w:r>
           <w:t xml:space="preserve">From then on, please use the </w:t>
         </w:r>
@@ -1051,7 +1060,7 @@
           <w:t xml:space="preserve">storage location to apply every change you want </w:t>
         </w:r>
       </w:ins>
-      <w:ins w:id="111" w:author="Pawel KAMINSKI" w:date="2025-01-06T11:48:00Z">
+      <w:ins w:id="114" w:author="Pawel KAMINSKI" w:date="2025-01-06T11:48:00Z">
         <w:r>
           <w:t xml:space="preserve">to make. </w:t>
         </w:r>
@@ -1059,7 +1068,7 @@
           <w:t>Changes you make on those files will be reflected in the das</w:t>
         </w:r>
       </w:ins>
-      <w:ins w:id="112" w:author="Pawel KAMINSKI" w:date="2025-01-06T11:49:00Z">
+      <w:ins w:id="115" w:author="Pawel KAMINSKI" w:date="2025-01-06T11:49:00Z">
         <w:r>
           <w:t>hboard and in the digital version of your publication.</w:t>
         </w:r>
@@ -1069,7 +1078,7 @@
       <w:pPr>
         <w:pStyle w:val="BodyText"/>
         <w:rPr>
-          <w:ins w:id="113" w:author="Pawel KAMINSKI" w:date="2025-01-06T11:24:00Z"/>
+          <w:ins w:id="116" w:author="Pawel KAMINSKI" w:date="2025-01-06T11:24:00Z"/>
         </w:rPr>
       </w:pPr>
     </w:p>
@@ -1077,10 +1086,10 @@
       <w:pPr>
         <w:pStyle w:val="BodyText"/>
         <w:rPr>
-          <w:ins w:id="114" w:author="Pawel KAMINSKI" w:date="2025-01-06T11:13:00Z"/>
-        </w:rPr>
-      </w:pPr>
-      <w:ins w:id="115" w:author="Pawel KAMINSKI" w:date="2025-01-06T11:13:00Z">
+          <w:ins w:id="117" w:author="Pawel KAMINSKI" w:date="2025-01-06T11:13:00Z"/>
+        </w:rPr>
+      </w:pPr>
+      <w:ins w:id="118" w:author="Pawel KAMINSKI" w:date="2025-01-06T11:13:00Z">
         <w:r>
           <w:t>:::{important}</w:t>
         </w:r>
@@ -1088,17 +1097,17 @@
           <w:br/>
         </w:r>
       </w:ins>
-      <w:ins w:id="116" w:author="Pawel KAMINSKI" w:date="2025-01-06T11:51:00Z">
+      <w:ins w:id="119" w:author="Pawel KAMINSKI" w:date="2025-01-06T11:51:00Z">
         <w:r>
           <w:t xml:space="preserve">Please make sure that your submission complies with the guidelines. </w:t>
         </w:r>
       </w:ins>
-      <w:ins w:id="117" w:author="Pawel KAMINSKI" w:date="2025-01-06T11:50:00Z">
+      <w:ins w:id="120" w:author="Pawel KAMINSKI" w:date="2025-01-06T11:50:00Z">
         <w:r>
           <w:t xml:space="preserve">When you think the manuscript is ready for editing, contact </w:t>
         </w:r>
       </w:ins>
-      <w:ins w:id="118" w:author="Pawel KAMINSKI" w:date="2025-01-06T11:51:00Z">
+      <w:ins w:id="121" w:author="Pawel KAMINSKI" w:date="2025-01-06T11:51:00Z">
         <w:r>
           <w:fldChar w:fldCharType="begin"/>
         </w:r>
@@ -1127,7 +1136,7 @@
           <w:t>.</w:t>
         </w:r>
       </w:ins>
-      <w:ins w:id="119" w:author="Pawel KAMINSKI" w:date="2025-01-06T11:13:00Z">
+      <w:ins w:id="122" w:author="Pawel KAMINSKI" w:date="2025-01-06T11:13:00Z">
         <w:r>
           <w:br/>
           <w:t>:::</w:t>
@@ -1143,27 +1152,27 @@
       <w:pPr>
         <w:pStyle w:val="Heading2"/>
       </w:pPr>
-      <w:commentRangeStart w:id="120"/>
-      <w:commentRangeStart w:id="121"/>
-      <w:commentRangeStart w:id="122"/>
+      <w:commentRangeStart w:id="123"/>
+      <w:commentRangeStart w:id="124"/>
+      <w:commentRangeStart w:id="125"/>
       <w:r>
         <w:t>File Formats</w:t>
       </w:r>
-      <w:commentRangeEnd w:id="120"/>
+      <w:commentRangeEnd w:id="123"/>
       <w:r>
         <w:rPr>
           <w:rStyle w:val="CommentReference"/>
         </w:rPr>
-        <w:commentReference w:id="120"/>
-      </w:r>
-      <w:commentRangeEnd w:id="121"/>
+        <w:commentReference w:id="123"/>
+      </w:r>
+      <w:commentRangeEnd w:id="124"/>
       <w:r>
         <w:rPr>
           <w:rStyle w:val="CommentReference"/>
         </w:rPr>
-        <w:commentReference w:id="121"/>
-      </w:r>
-      <w:commentRangeEnd w:id="122"/>
+        <w:commentReference w:id="124"/>
+      </w:r>
+      <w:commentRangeEnd w:id="125"/>
       <w:r>
         <w:rPr>
           <w:rStyle w:val="CommentReference"/>
@@ -1172,7 +1181,7 @@
           <w:bCs w:val="0"/>
           <w:color w:val="auto"/>
         </w:rPr>
-        <w:commentReference w:id="122"/>
+        <w:commentReference w:id="125"/>
       </w:r>
     </w:p>
     <w:p>
@@ -1210,82 +1219,82 @@
       <w:r>
         <w:t xml:space="preserve"> notebooks, </w:t>
       </w:r>
-      <w:commentRangeStart w:id="124"/>
-      <w:commentRangeStart w:id="125"/>
-      <w:commentRangeStart w:id="126"/>
       <w:commentRangeStart w:id="127"/>
+      <w:commentRangeStart w:id="128"/>
+      <w:commentRangeStart w:id="129"/>
+      <w:commentRangeStart w:id="130"/>
       <w:r>
         <w:t>etc. is by including them in `.docx` files.</w:t>
       </w:r>
-      <w:commentRangeEnd w:id="124"/>
+      <w:commentRangeEnd w:id="127"/>
       <w:r>
         <w:rPr>
           <w:rStyle w:val="CommentReference"/>
         </w:rPr>
-        <w:commentReference w:id="124"/>
-      </w:r>
-      <w:commentRangeEnd w:id="125"/>
+        <w:commentReference w:id="127"/>
+      </w:r>
+      <w:commentRangeEnd w:id="128"/>
       <w:r>
         <w:rPr>
           <w:rStyle w:val="CommentReference"/>
         </w:rPr>
-        <w:commentReference w:id="125"/>
-      </w:r>
-      <w:commentRangeEnd w:id="126"/>
+        <w:commentReference w:id="128"/>
+      </w:r>
+      <w:commentRangeEnd w:id="129"/>
       <w:r>
         <w:rPr>
           <w:rStyle w:val="CommentReference"/>
         </w:rPr>
-        <w:commentReference w:id="126"/>
-      </w:r>
-      <w:commentRangeEnd w:id="127"/>
+        <w:commentReference w:id="129"/>
+      </w:r>
+      <w:commentRangeEnd w:id="130"/>
       <w:r>
         <w:rPr>
           <w:rStyle w:val="CommentReference"/>
         </w:rPr>
-        <w:commentReference w:id="127"/>
-      </w:r>
-      <w:ins w:id="129" w:author="Pawel KAMINSKI" w:date="2024-06-03T14:22:00Z">
+        <w:commentReference w:id="130"/>
+      </w:r>
+      <w:ins w:id="132" w:author="Pawel KAMINSKI" w:date="2024-06-03T14:22:00Z">
         <w:r>
           <w:t xml:space="preserve"> </w:t>
         </w:r>
       </w:ins>
-      <w:ins w:id="130" w:author="Pawel KAMINSKI" w:date="2024-06-03T15:19:00Z">
+      <w:ins w:id="133" w:author="Pawel KAMINSKI" w:date="2024-06-03T15:19:00Z">
         <w:r>
           <w:t xml:space="preserve">As an author you are required </w:t>
         </w:r>
       </w:ins>
-      <w:ins w:id="131" w:author="Pawel KAMINSKI" w:date="2024-06-03T14:23:00Z">
+      <w:ins w:id="134" w:author="Pawel KAMINSKI" w:date="2024-06-03T14:23:00Z">
         <w:r>
           <w:t xml:space="preserve">to </w:t>
         </w:r>
       </w:ins>
-      <w:ins w:id="132" w:author="Pawel KAMINSKI" w:date="2024-06-03T15:19:00Z">
+      <w:ins w:id="135" w:author="Pawel KAMINSKI" w:date="2024-06-03T15:19:00Z">
         <w:r>
           <w:t>upload</w:t>
         </w:r>
       </w:ins>
-      <w:ins w:id="133" w:author="Pawel KAMINSKI" w:date="2024-06-03T15:18:00Z">
+      <w:ins w:id="136" w:author="Pawel KAMINSKI" w:date="2024-06-03T15:18:00Z">
         <w:r>
           <w:t xml:space="preserve"> all the files inclu</w:t>
         </w:r>
       </w:ins>
-      <w:ins w:id="134" w:author="Pawel KAMINSKI" w:date="2024-06-03T15:19:00Z">
+      <w:ins w:id="137" w:author="Pawel KAMINSKI" w:date="2024-06-03T15:19:00Z">
         <w:r>
           <w:t>ded in you manuscript</w:t>
         </w:r>
       </w:ins>
-      <w:ins w:id="135" w:author="Pawel KAMINSKI" w:date="2024-06-03T14:23:00Z">
+      <w:ins w:id="138" w:author="Pawel KAMINSKI" w:date="2024-06-03T14:23:00Z">
         <w:r>
           <w:t xml:space="preserve"> </w:t>
         </w:r>
       </w:ins>
-      <w:ins w:id="136" w:author="Pawel KAMINSKI" w:date="2024-06-03T15:19:00Z">
+      <w:ins w:id="139" w:author="Pawel KAMINSKI" w:date="2024-06-03T15:19:00Z">
         <w:r>
           <w:t>to</w:t>
         </w:r>
       </w:ins>
-      <w:ins w:id="137" w:author="Pawel KAMINSKI" w:date="2024-06-03T14:23:00Z">
+      <w:ins w:id="140" w:author="Pawel KAMINSKI" w:date="2024-06-03T14:23:00Z">
         <w:r>
           <w:t xml:space="preserve"> the `assets` folder.</w:t>
         </w:r>
@@ -1310,7 +1319,7 @@
         <w:pStyle w:val="BodyText"/>
         <w:jc w:val="both"/>
         <w:rPr>
-          <w:ins w:id="138" w:author="Borlinghaus, Anton" w:date="2024-04-30T14:02:00Z"/>
+          <w:ins w:id="141" w:author="Borlinghaus, Anton" w:date="2024-04-30T14:02:00Z"/>
         </w:rPr>
       </w:pPr>
       <w:r>
@@ -1365,15 +1374,11 @@
         <w:t xml:space="preserve">` </w:t>
       </w:r>
       <w:r>
-        <w:t xml:space="preserve">saved from </w:t>
-      </w:r>
-      <w:r>
-        <w:lastRenderedPageBreak/>
-        <w:t xml:space="preserve">Google Doc will </w:t>
-      </w:r>
-      <w:r>
-        <w:rPr>
-          <w:rPrChange w:id="139" w:author="Pawel KAMINSKI" w:date="2025-03-04T10:50:00Z" w16du:dateUtc="2025-03-04T09:50:00Z">
+        <w:t xml:space="preserve">saved from Google Doc will </w:t>
+      </w:r>
+      <w:r>
+        <w:rPr>
+          <w:rPrChange w:id="142" w:author="Pawel KAMINSKI" w:date="2025-03-04T10:50:00Z" w16du:dateUtc="2025-03-04T09:50:00Z">
             <w:rPr>
               <w:i/>
               <w:iCs/>
@@ -1418,21 +1423,21 @@
         <w:pStyle w:val="BodyText"/>
         <w:jc w:val="both"/>
       </w:pPr>
-      <w:commentRangeStart w:id="140"/>
-      <w:commentRangeStart w:id="141"/>
-      <w:commentRangeEnd w:id="140"/>
+      <w:commentRangeStart w:id="143"/>
+      <w:commentRangeStart w:id="144"/>
+      <w:commentRangeEnd w:id="143"/>
       <w:r>
         <w:rPr>
           <w:rStyle w:val="CommentReference"/>
         </w:rPr>
-        <w:commentReference w:id="140"/>
-      </w:r>
-      <w:commentRangeEnd w:id="141"/>
+        <w:commentReference w:id="143"/>
+      </w:r>
+      <w:commentRangeEnd w:id="144"/>
       <w:r>
         <w:rPr>
           <w:rStyle w:val="CommentReference"/>
         </w:rPr>
-        <w:commentReference w:id="141"/>
+        <w:commentReference w:id="144"/>
       </w:r>
     </w:p>
     <w:p>
@@ -1463,9 +1468,9 @@
                 <w:bCs/>
               </w:rPr>
             </w:pPr>
-            <w:commentRangeStart w:id="142"/>
-            <w:commentRangeStart w:id="143"/>
-            <w:commentRangeStart w:id="144"/>
+            <w:commentRangeStart w:id="145"/>
+            <w:commentRangeStart w:id="146"/>
+            <w:commentRangeStart w:id="147"/>
             <w:r>
               <w:rPr>
                 <w:b/>
@@ -1494,30 +1499,30 @@
               </w:rPr>
               <w:t>Accepted file format</w:t>
             </w:r>
-            <w:commentRangeEnd w:id="142"/>
+            <w:commentRangeEnd w:id="145"/>
             <w:r>
               <w:rPr>
                 <w:rStyle w:val="CommentReference"/>
               </w:rPr>
-              <w:commentReference w:id="142"/>
+              <w:commentReference w:id="145"/>
             </w:r>
-            <w:commentRangeEnd w:id="143"/>
+            <w:commentRangeEnd w:id="146"/>
             <w:r>
               <w:rPr>
                 <w:rStyle w:val="CommentReference"/>
               </w:rPr>
-              <w:commentReference w:id="143"/>
+              <w:commentReference w:id="146"/>
             </w:r>
             <w:r>
               <w:rPr>
                 <w:rStyle w:val="CommentReference"/>
               </w:rPr>
-              <w:commentReference w:id="144"/>
+              <w:commentReference w:id="147"/>
             </w:r>
           </w:p>
         </w:tc>
       </w:tr>
-      <w:commentRangeEnd w:id="144"/>
+      <w:commentRangeEnd w:id="147"/>
       <w:tr>
         <w:tc>
           <w:tcPr>
@@ -1600,7 +1605,7 @@
       <w:pPr>
         <w:pStyle w:val="BodyText"/>
         <w:rPr>
-          <w:ins w:id="146" w:author="Pawel KAMINSKI" w:date="2024-06-03T15:49:00Z"/>
+          <w:ins w:id="149" w:author="Pawel KAMINSKI" w:date="2024-06-03T15:49:00Z"/>
         </w:rPr>
       </w:pPr>
     </w:p>
@@ -1608,15 +1613,15 @@
       <w:pPr>
         <w:pStyle w:val="BodyText"/>
         <w:rPr>
-          <w:ins w:id="147" w:author="Pawel KAMINSKI" w:date="2024-06-03T15:49:00Z"/>
-        </w:rPr>
-      </w:pPr>
-      <w:ins w:id="148" w:author="Pawel KAMINSKI" w:date="2024-06-03T15:49:00Z">
+          <w:ins w:id="150" w:author="Pawel KAMINSKI" w:date="2024-06-03T15:49:00Z"/>
+        </w:rPr>
+      </w:pPr>
+      <w:ins w:id="151" w:author="Pawel KAMINSKI" w:date="2024-06-03T15:49:00Z">
         <w:r>
           <w:t xml:space="preserve">In those </w:t>
         </w:r>
       </w:ins>
-      <w:ins w:id="149" w:author="Pawel KAMINSKI" w:date="2024-06-03T15:50:00Z">
+      <w:ins w:id="152" w:author="Pawel KAMINSKI" w:date="2024-06-03T15:50:00Z">
         <w:r>
           <w:t xml:space="preserve">files you can include </w:t>
         </w:r>
@@ -1627,7 +1632,7 @@
           <w:t>`assets` folder and write a correct reference</w:t>
         </w:r>
       </w:ins>
-      <w:ins w:id="150" w:author="Pawel KAMINSKI" w:date="2024-06-03T15:51:00Z">
+      <w:ins w:id="153" w:author="Pawel KAMINSKI" w:date="2024-06-03T15:51:00Z">
         <w:r>
           <w:t xml:space="preserve"> to those files inside of `.docx` or `.</w:t>
         </w:r>
@@ -1645,7 +1650,7 @@
       <w:pPr>
         <w:pStyle w:val="BodyText"/>
         <w:rPr>
-          <w:ins w:id="151" w:author="Pawel KAMINSKI" w:date="2024-06-03T15:49:00Z"/>
+          <w:ins w:id="154" w:author="Pawel KAMINSKI" w:date="2024-06-03T15:49:00Z"/>
         </w:rPr>
       </w:pPr>
     </w:p>
@@ -1661,7 +1666,7 @@
       </w:tblGrid>
       <w:tr>
         <w:trPr>
-          <w:ins w:id="152" w:author="Pawel KAMINSKI" w:date="2024-12-19T12:56:00Z"/>
+          <w:ins w:id="155" w:author="Pawel KAMINSKI" w:date="2024-12-19T12:56:00Z"/>
         </w:trPr>
         <w:tc>
           <w:tcPr>
@@ -1671,10 +1676,10 @@
             <w:pPr>
               <w:pStyle w:val="BodyText"/>
               <w:rPr>
-                <w:ins w:id="153" w:author="Pawel KAMINSKI" w:date="2024-12-19T12:56:00Z"/>
+                <w:ins w:id="156" w:author="Pawel KAMINSKI" w:date="2024-12-19T12:56:00Z"/>
               </w:rPr>
             </w:pPr>
-            <w:ins w:id="154" w:author="Pawel KAMINSKI" w:date="2024-12-19T12:56:00Z">
+            <w:ins w:id="157" w:author="Pawel KAMINSKI" w:date="2024-12-19T12:56:00Z">
               <w:r>
                 <w:rPr>
                   <w:b/>
@@ -1693,34 +1698,18 @@
             <w:pPr>
               <w:pStyle w:val="BodyText"/>
               <w:rPr>
-                <w:ins w:id="155" w:author="Pawel KAMINSKI" w:date="2024-12-19T12:56:00Z"/>
+                <w:ins w:id="158" w:author="Pawel KAMINSKI" w:date="2024-12-19T12:56:00Z"/>
                 <w:i/>
                 <w:iCs/>
               </w:rPr>
             </w:pPr>
-            <w:ins w:id="156" w:author="Pawel KAMINSKI" w:date="2024-12-19T12:56:00Z">
+            <w:ins w:id="159" w:author="Pawel KAMINSKI" w:date="2024-12-19T12:56:00Z">
               <w:r>
                 <w:rPr>
                   <w:b/>
                   <w:bCs/>
                 </w:rPr>
                 <w:t>Accepted file format</w:t>
-              </w:r>
-              <w:commentRangeStart w:id="157"/>
-              <w:commentRangeEnd w:id="157"/>
-              <w:r>
-                <w:rPr>
-                  <w:rStyle w:val="CommentReference"/>
-                </w:rPr>
-                <w:commentReference w:id="157"/>
-              </w:r>
-              <w:commentRangeStart w:id="158"/>
-              <w:commentRangeEnd w:id="158"/>
-              <w:r>
-                <w:rPr>
-                  <w:rStyle w:val="CommentReference"/>
-                </w:rPr>
-                <w:commentReference w:id="158"/>
               </w:r>
               <w:commentRangeStart w:id="160"/>
               <w:commentRangeEnd w:id="160"/>
@@ -1730,13 +1719,29 @@
                 </w:rPr>
                 <w:commentReference w:id="160"/>
               </w:r>
+              <w:commentRangeStart w:id="161"/>
+              <w:commentRangeEnd w:id="161"/>
+              <w:r>
+                <w:rPr>
+                  <w:rStyle w:val="CommentReference"/>
+                </w:rPr>
+                <w:commentReference w:id="161"/>
+              </w:r>
+              <w:commentRangeStart w:id="163"/>
+              <w:commentRangeEnd w:id="163"/>
+              <w:r>
+                <w:rPr>
+                  <w:rStyle w:val="CommentReference"/>
+                </w:rPr>
+                <w:commentReference w:id="163"/>
+              </w:r>
             </w:ins>
           </w:p>
         </w:tc>
       </w:tr>
       <w:tr>
         <w:trPr>
-          <w:ins w:id="161" w:author="Pawel KAMINSKI" w:date="2024-06-03T15:49:00Z"/>
+          <w:ins w:id="164" w:author="Pawel KAMINSKI" w:date="2024-06-03T15:49:00Z"/>
         </w:trPr>
         <w:tc>
           <w:tcPr>
@@ -1746,10 +1751,10 @@
             <w:pPr>
               <w:pStyle w:val="BodyText"/>
               <w:rPr>
-                <w:ins w:id="162" w:author="Pawel KAMINSKI" w:date="2024-06-03T15:49:00Z"/>
+                <w:ins w:id="165" w:author="Pawel KAMINSKI" w:date="2024-06-03T15:49:00Z"/>
               </w:rPr>
             </w:pPr>
-            <w:ins w:id="163" w:author="Pawel KAMINSKI" w:date="2024-06-03T15:49:00Z">
+            <w:ins w:id="166" w:author="Pawel KAMINSKI" w:date="2024-06-03T15:49:00Z">
               <w:r>
                 <w:t>Illustrations</w:t>
               </w:r>
@@ -1764,12 +1769,12 @@
             <w:pPr>
               <w:pStyle w:val="BodyText"/>
               <w:rPr>
-                <w:ins w:id="164" w:author="Pawel KAMINSKI" w:date="2024-06-03T15:49:00Z"/>
+                <w:ins w:id="167" w:author="Pawel KAMINSKI" w:date="2024-06-03T15:49:00Z"/>
                 <w:i/>
                 <w:iCs/>
               </w:rPr>
             </w:pPr>
-            <w:ins w:id="165" w:author="Pawel KAMINSKI" w:date="2024-06-03T15:49:00Z">
+            <w:ins w:id="168" w:author="Pawel KAMINSKI" w:date="2024-06-03T15:49:00Z">
               <w:r>
                 <w:rPr>
                   <w:i/>
@@ -1792,7 +1797,7 @@
                 <w:t>f</w:t>
               </w:r>
             </w:ins>
-            <w:ins w:id="166" w:author="Pawel KAMINSKI" w:date="2024-06-03T15:51:00Z">
+            <w:ins w:id="169" w:author="Pawel KAMINSKI" w:date="2024-06-03T15:51:00Z">
               <w:r>
                 <w:rPr>
                   <w:i/>
@@ -1801,7 +1806,7 @@
                 <w:t>,</w:t>
               </w:r>
             </w:ins>
-            <w:ins w:id="167" w:author="Pawel KAMINSKI" w:date="2024-06-03T15:49:00Z">
+            <w:ins w:id="170" w:author="Pawel KAMINSKI" w:date="2024-06-03T15:49:00Z">
               <w:r>
                 <w:rPr>
                   <w:i/>
@@ -1824,7 +1829,7 @@
       </w:tr>
       <w:tr>
         <w:trPr>
-          <w:ins w:id="168" w:author="Pawel KAMINSKI" w:date="2024-06-03T15:49:00Z"/>
+          <w:ins w:id="171" w:author="Pawel KAMINSKI" w:date="2024-06-03T15:49:00Z"/>
         </w:trPr>
         <w:tc>
           <w:tcPr>
@@ -1834,10 +1839,10 @@
             <w:pPr>
               <w:pStyle w:val="BodyText"/>
               <w:rPr>
-                <w:ins w:id="169" w:author="Pawel KAMINSKI" w:date="2024-06-03T15:49:00Z"/>
+                <w:ins w:id="172" w:author="Pawel KAMINSKI" w:date="2024-06-03T15:49:00Z"/>
               </w:rPr>
             </w:pPr>
-            <w:ins w:id="170" w:author="Pawel KAMINSKI" w:date="2024-06-03T15:49:00Z">
+            <w:ins w:id="173" w:author="Pawel KAMINSKI" w:date="2024-06-03T15:49:00Z">
               <w:r>
                 <w:t>Video</w:t>
               </w:r>
@@ -1852,12 +1857,12 @@
             <w:pPr>
               <w:pStyle w:val="BodyText"/>
               <w:rPr>
-                <w:ins w:id="171" w:author="Pawel KAMINSKI" w:date="2024-06-03T15:49:00Z"/>
+                <w:ins w:id="174" w:author="Pawel KAMINSKI" w:date="2024-06-03T15:49:00Z"/>
                 <w:i/>
                 <w:iCs/>
               </w:rPr>
             </w:pPr>
-            <w:ins w:id="172" w:author="Pawel KAMINSKI" w:date="2024-06-03T15:51:00Z">
+            <w:ins w:id="175" w:author="Pawel KAMINSKI" w:date="2024-06-03T15:51:00Z">
               <w:r>
                 <w:rPr>
                   <w:i/>
@@ -1871,7 +1876,7 @@
       </w:tr>
       <w:tr>
         <w:trPr>
-          <w:ins w:id="173" w:author="Pawel KAMINSKI" w:date="2024-06-03T15:49:00Z"/>
+          <w:ins w:id="176" w:author="Pawel KAMINSKI" w:date="2024-06-03T15:49:00Z"/>
         </w:trPr>
         <w:tc>
           <w:tcPr>
@@ -1881,20 +1886,20 @@
             <w:pPr>
               <w:pStyle w:val="BodyText"/>
               <w:rPr>
-                <w:ins w:id="174" w:author="Pawel KAMINSKI" w:date="2024-06-03T15:49:00Z"/>
+                <w:ins w:id="177" w:author="Pawel KAMINSKI" w:date="2024-06-03T15:49:00Z"/>
               </w:rPr>
             </w:pPr>
-            <w:ins w:id="175" w:author="Pawel KAMINSKI" w:date="2024-06-03T15:51:00Z">
+            <w:ins w:id="178" w:author="Pawel KAMINSKI" w:date="2024-06-03T15:51:00Z">
               <w:r>
                 <w:t>Interactive e</w:t>
               </w:r>
             </w:ins>
-            <w:ins w:id="176" w:author="Pawel KAMINSKI" w:date="2024-06-03T15:49:00Z">
+            <w:ins w:id="179" w:author="Pawel KAMINSKI" w:date="2024-06-03T15:49:00Z">
               <w:r>
                 <w:t>lements</w:t>
               </w:r>
             </w:ins>
-            <w:ins w:id="177" w:author="Pawel KAMINSKI" w:date="2024-06-03T15:51:00Z">
+            <w:ins w:id="180" w:author="Pawel KAMINSKI" w:date="2024-06-03T15:51:00Z">
               <w:r>
                 <w:t xml:space="preserve"> for the digital version</w:t>
               </w:r>
@@ -1909,12 +1914,12 @@
             <w:pPr>
               <w:pStyle w:val="BodyText"/>
               <w:rPr>
-                <w:ins w:id="178" w:author="Pawel KAMINSKI" w:date="2024-06-03T15:49:00Z"/>
+                <w:ins w:id="181" w:author="Pawel KAMINSKI" w:date="2024-06-03T15:49:00Z"/>
                 <w:i/>
                 <w:iCs/>
               </w:rPr>
             </w:pPr>
-            <w:ins w:id="179" w:author="Pawel KAMINSKI" w:date="2024-06-03T15:52:00Z">
+            <w:ins w:id="182" w:author="Pawel KAMINSKI" w:date="2024-06-03T15:52:00Z">
               <w:r>
                 <w:rPr>
                   <w:i/>
@@ -1923,7 +1928,7 @@
                 <w:t>h</w:t>
               </w:r>
             </w:ins>
-            <w:ins w:id="180" w:author="Pawel KAMINSKI" w:date="2024-06-03T15:49:00Z">
+            <w:ins w:id="183" w:author="Pawel KAMINSKI" w:date="2024-06-03T15:49:00Z">
               <w:r>
                 <w:rPr>
                   <w:i/>
@@ -1940,7 +1945,7 @@
       <w:pPr>
         <w:pStyle w:val="BodyText"/>
         <w:rPr>
-          <w:ins w:id="181" w:author="Pawel KAMINSKI" w:date="2024-06-03T15:52:00Z"/>
+          <w:ins w:id="184" w:author="Pawel KAMINSKI" w:date="2024-06-03T15:52:00Z"/>
         </w:rPr>
       </w:pPr>
     </w:p>
@@ -1948,15 +1953,15 @@
       <w:pPr>
         <w:pStyle w:val="BodyText"/>
         <w:rPr>
-          <w:ins w:id="182" w:author="Pawel KAMINSKI" w:date="2024-06-03T15:49:00Z"/>
-        </w:rPr>
-      </w:pPr>
-      <w:ins w:id="183" w:author="Pawel KAMINSKI" w:date="2024-06-03T15:52:00Z">
+          <w:ins w:id="185" w:author="Pawel KAMINSKI" w:date="2024-06-03T15:49:00Z"/>
+        </w:rPr>
+      </w:pPr>
+      <w:ins w:id="186" w:author="Pawel KAMINSKI" w:date="2024-06-03T15:52:00Z">
         <w:r>
           <w:t xml:space="preserve">The `.html` files included in the `.docx` files can </w:t>
         </w:r>
       </w:ins>
-      <w:ins w:id="184" w:author="Pawel KAMINSKI" w:date="2024-06-03T15:53:00Z">
+      <w:ins w:id="187" w:author="Pawel KAMINSKI" w:date="2024-06-03T15:53:00Z">
         <w:r>
           <w:t>contain references to other files in the `assets` directory, for example `.</w:t>
         </w:r>
@@ -1990,12 +1995,12 @@
       <w:r>
         <w:t xml:space="preserve">Submission </w:t>
       </w:r>
-      <w:del w:id="185" w:author="Pawel KAMINSKI" w:date="2024-06-03T12:41:00Z">
+      <w:del w:id="188" w:author="Pawel KAMINSKI" w:date="2024-06-03T12:41:00Z">
         <w:r>
           <w:delText>structure</w:delText>
         </w:r>
       </w:del>
-      <w:ins w:id="186" w:author="Pawel KAMINSKI" w:date="2024-06-03T12:41:00Z">
+      <w:ins w:id="189" w:author="Pawel KAMINSKI" w:date="2024-06-03T12:41:00Z">
         <w:r>
           <w:t>Structure</w:t>
         </w:r>
@@ -2010,7 +2015,11 @@
       </w:r>
       <w:r>
         <w:br/>
-        <w:t xml:space="preserve">Submitting your book as a one file can result in unexpected behaviors. We recommend the authors to split the manuscript </w:t>
+        <w:t xml:space="preserve">Submitting your book as a one file can result in unexpected behaviors. We recommend the </w:t>
+      </w:r>
+      <w:r>
+        <w:lastRenderedPageBreak/>
+        <w:t xml:space="preserve">authors to split the manuscript </w:t>
       </w:r>
       <w:r>
         <w:t>into</w:t>
@@ -2036,24 +2045,24 @@
       <w:r>
         <w:t xml:space="preserve">As an author, you are required to upload a </w:t>
       </w:r>
-      <w:commentRangeStart w:id="187"/>
-      <w:commentRangeStart w:id="188"/>
+      <w:commentRangeStart w:id="190"/>
+      <w:commentRangeStart w:id="191"/>
       <w:r>
         <w:t>package</w:t>
       </w:r>
-      <w:commentRangeEnd w:id="187"/>
+      <w:commentRangeEnd w:id="190"/>
       <w:r>
         <w:rPr>
           <w:rStyle w:val="CommentReference"/>
         </w:rPr>
-        <w:commentReference w:id="187"/>
-      </w:r>
-      <w:commentRangeEnd w:id="188"/>
+        <w:commentReference w:id="190"/>
+      </w:r>
+      <w:commentRangeEnd w:id="191"/>
       <w:r>
         <w:rPr>
           <w:rStyle w:val="CommentReference"/>
         </w:rPr>
-        <w:commentReference w:id="188"/>
+        <w:commentReference w:id="191"/>
       </w:r>
       <w:r>
         <w:t xml:space="preserve"> of a following structure:</w:t>
@@ -2085,7 +2094,6 @@
           <w:szCs w:val="17"/>
           <w:shd w:val="clear" w:color="auto" w:fill="FFFFFF"/>
         </w:rPr>
-        <w:lastRenderedPageBreak/>
         <w:t>:::{code}</w:t>
       </w:r>
     </w:p>
@@ -2129,7 +2137,7 @@
         </w:pBdr>
         <w:spacing w:line="240" w:lineRule="atLeast"/>
         <w:rPr>
-          <w:del w:id="189" w:author="Pawel KAMINSKI" w:date="2024-06-17T11:15:00Z"/>
+          <w:del w:id="192" w:author="Pawel KAMINSKI" w:date="2024-06-17T11:15:00Z"/>
           <w:rStyle w:val="HTMLCode"/>
           <w:color w:val="737373"/>
           <w:sz w:val="17"/>
@@ -2137,7 +2145,7 @@
           <w:shd w:val="clear" w:color="auto" w:fill="FFFFFF"/>
         </w:rPr>
       </w:pPr>
-      <w:del w:id="190" w:author="Pawel KAMINSKI" w:date="2024-06-17T11:15:00Z">
+      <w:del w:id="193" w:author="Pawel KAMINSKI" w:date="2024-06-17T11:15:00Z">
         <w:r>
           <w:rPr>
             <w:rStyle w:val="HTMLCode"/>
@@ -2551,10 +2559,10 @@
         </w:numPr>
         <w:jc w:val="both"/>
         <w:rPr>
-          <w:del w:id="191" w:author="Pawel KAMINSKI" w:date="2024-06-17T11:15:00Z"/>
-        </w:rPr>
-      </w:pPr>
-      <w:del w:id="192" w:author="Pawel KAMINSKI" w:date="2024-06-17T11:15:00Z">
+          <w:del w:id="194" w:author="Pawel KAMINSKI" w:date="2024-06-17T11:15:00Z"/>
+        </w:rPr>
+      </w:pPr>
+      <w:del w:id="195" w:author="Pawel KAMINSKI" w:date="2024-06-17T11:15:00Z">
         <w:r>
           <w:delText xml:space="preserve">a </w:delText>
         </w:r>
@@ -2732,7 +2740,7 @@
         </w:pBdr>
         <w:spacing w:line="240" w:lineRule="atLeast"/>
         <w:rPr>
-          <w:del w:id="193" w:author="Pawel KAMINSKI" w:date="2024-06-17T11:15:00Z"/>
+          <w:del w:id="196" w:author="Pawel KAMINSKI" w:date="2024-06-17T11:15:00Z"/>
           <w:rStyle w:val="HTMLCode"/>
           <w:color w:val="737373"/>
           <w:sz w:val="17"/>
@@ -2740,7 +2748,7 @@
           <w:shd w:val="clear" w:color="auto" w:fill="FFFFFF"/>
         </w:rPr>
       </w:pPr>
-      <w:del w:id="194" w:author="Pawel KAMINSKI" w:date="2024-06-17T11:15:00Z">
+      <w:del w:id="197" w:author="Pawel KAMINSKI" w:date="2024-06-17T11:15:00Z">
         <w:r>
           <w:rPr>
             <w:rStyle w:val="HTMLCode"/>
@@ -2800,7 +2808,7 @@
         </w:rPr>
         <w:t>chapter_</w:t>
       </w:r>
-      <w:del w:id="195" w:author="Pawel KAMINSKI" w:date="2024-12-31T00:16:00Z">
+      <w:del w:id="198" w:author="Pawel KAMINSKI" w:date="2024-12-31T00:16:00Z">
         <w:r>
           <w:rPr>
             <w:rStyle w:val="HTMLCode"/>
@@ -2812,7 +2820,7 @@
           <w:delText>1</w:delText>
         </w:r>
       </w:del>
-      <w:ins w:id="196" w:author="Pawel KAMINSKI" w:date="2024-12-31T00:16:00Z">
+      <w:ins w:id="199" w:author="Pawel KAMINSKI" w:date="2024-12-31T00:16:00Z">
         <w:r>
           <w:rPr>
             <w:rStyle w:val="HTMLCode"/>
@@ -2872,7 +2880,7 @@
         </w:rPr>
         <w:t>chapter_</w:t>
       </w:r>
-      <w:ins w:id="197" w:author="Pawel KAMINSKI" w:date="2024-12-31T00:16:00Z">
+      <w:ins w:id="200" w:author="Pawel KAMINSKI" w:date="2024-12-31T00:16:00Z">
         <w:r>
           <w:rPr>
             <w:rStyle w:val="HTMLCode"/>
@@ -2884,7 +2892,7 @@
           <w:t>two</w:t>
         </w:r>
       </w:ins>
-      <w:del w:id="198" w:author="Pawel KAMINSKI" w:date="2024-12-31T00:16:00Z">
+      <w:del w:id="201" w:author="Pawel KAMINSKI" w:date="2024-12-31T00:16:00Z">
         <w:r>
           <w:rPr>
             <w:rStyle w:val="HTMLCode"/>
@@ -3230,6 +3238,7 @@
           <w:szCs w:val="17"/>
           <w:shd w:val="clear" w:color="auto" w:fill="FFFFFF"/>
         </w:rPr>
+        <w:lastRenderedPageBreak/>
         <w:t>.</w:t>
       </w:r>
     </w:p>
@@ -3244,7 +3253,7 @@
         </w:pBdr>
         <w:spacing w:line="240" w:lineRule="atLeast"/>
         <w:rPr>
-          <w:del w:id="199" w:author="Pawel KAMINSKI" w:date="2024-06-17T11:15:00Z"/>
+          <w:del w:id="202" w:author="Pawel KAMINSKI" w:date="2024-06-17T11:15:00Z"/>
           <w:rStyle w:val="HTMLCode"/>
           <w:color w:val="737373"/>
           <w:sz w:val="17"/>
@@ -3252,7 +3261,7 @@
           <w:shd w:val="clear" w:color="auto" w:fill="FFFFFF"/>
         </w:rPr>
       </w:pPr>
-      <w:del w:id="200" w:author="Pawel KAMINSKI" w:date="2024-06-17T11:15:00Z">
+      <w:del w:id="203" w:author="Pawel KAMINSKI" w:date="2024-06-17T11:15:00Z">
         <w:r>
           <w:rPr>
             <w:rStyle w:val="HTMLCode"/>
@@ -3507,7 +3516,7 @@
         </w:rPr>
         <w:t xml:space="preserve">    │   └── vid</w:t>
       </w:r>
-      <w:del w:id="201" w:author="Pawel KAMINSKI" w:date="2024-12-31T00:15:00Z">
+      <w:del w:id="204" w:author="Pawel KAMINSKI" w:date="2024-12-31T00:15:00Z">
         <w:r>
           <w:rPr>
             <w:rStyle w:val="HTMLCode"/>
@@ -3660,7 +3669,6 @@
           <w:sz w:val="17"/>
           <w:szCs w:val="17"/>
         </w:rPr>
-        <w:lastRenderedPageBreak/>
         <w:t xml:space="preserve">        └── 02_chapter-name/</w:t>
       </w:r>
     </w:p>
@@ -3723,7 +3731,7 @@
         <w:pStyle w:val="BodyText"/>
         <w:jc w:val="both"/>
         <w:rPr>
-          <w:ins w:id="202" w:author="Deutsch, Verena" w:date="2024-04-16T16:34:00Z"/>
+          <w:ins w:id="205" w:author="Deutsch, Verena" w:date="2024-04-16T16:34:00Z"/>
         </w:rPr>
       </w:pPr>
       <w:r>
@@ -3732,54 +3740,54 @@
       <w:r>
         <w:t xml:space="preserve"> </w:t>
       </w:r>
-      <w:commentRangeStart w:id="203"/>
-      <w:commentRangeStart w:id="204"/>
-      <w:commentRangeStart w:id="205"/>
-      <w:ins w:id="206" w:author="Deutsch, Verena" w:date="2024-04-16T16:34:00Z">
+      <w:commentRangeStart w:id="206"/>
+      <w:commentRangeStart w:id="207"/>
+      <w:commentRangeStart w:id="208"/>
+      <w:ins w:id="209" w:author="Deutsch, Verena" w:date="2024-04-16T16:34:00Z">
         <w:r>
           <w:t>All figures and tables which shall be included in the print and PDF version of your book, need to be n</w:t>
         </w:r>
       </w:ins>
-      <w:ins w:id="207" w:author="Deutsch, Verena" w:date="2024-04-16T16:33:00Z">
+      <w:ins w:id="210" w:author="Deutsch, Verena" w:date="2024-04-16T16:33:00Z">
         <w:r>
           <w:t>umber</w:t>
         </w:r>
       </w:ins>
-      <w:ins w:id="208" w:author="Deutsch, Verena" w:date="2024-04-16T16:34:00Z">
+      <w:ins w:id="211" w:author="Deutsch, Verena" w:date="2024-04-16T16:34:00Z">
         <w:r>
           <w:t>ed</w:t>
         </w:r>
       </w:ins>
-      <w:ins w:id="209" w:author="Deutsch, Verena" w:date="2024-04-16T16:33:00Z">
+      <w:ins w:id="212" w:author="Deutsch, Verena" w:date="2024-04-16T16:33:00Z">
         <w:r>
           <w:t xml:space="preserve"> and name</w:t>
         </w:r>
       </w:ins>
-      <w:ins w:id="210" w:author="Deutsch, Verena" w:date="2024-04-16T16:34:00Z">
+      <w:ins w:id="213" w:author="Deutsch, Verena" w:date="2024-04-16T16:34:00Z">
         <w:r>
           <w:t>d according to their figure caption inside the manuscript (e.g. “Figure 1” or “Chapter01_Fig01”).</w:t>
         </w:r>
       </w:ins>
-      <w:commentRangeEnd w:id="203"/>
+      <w:commentRangeEnd w:id="206"/>
       <w:r>
         <w:rPr>
           <w:rStyle w:val="CommentReference"/>
         </w:rPr>
-        <w:commentReference w:id="203"/>
-      </w:r>
-      <w:commentRangeEnd w:id="204"/>
+        <w:commentReference w:id="206"/>
+      </w:r>
+      <w:commentRangeEnd w:id="207"/>
       <w:r>
         <w:rPr>
           <w:rStyle w:val="CommentReference"/>
         </w:rPr>
-        <w:commentReference w:id="204"/>
-      </w:r>
-      <w:commentRangeEnd w:id="205"/>
+        <w:commentReference w:id="207"/>
+      </w:r>
+      <w:commentRangeEnd w:id="208"/>
       <w:r>
         <w:rPr>
           <w:rStyle w:val="CommentReference"/>
         </w:rPr>
-        <w:commentReference w:id="205"/>
+        <w:commentReference w:id="208"/>
       </w:r>
     </w:p>
     <w:p>
@@ -3787,7 +3795,7 @@
         <w:pStyle w:val="BodyText"/>
         <w:jc w:val="both"/>
         <w:rPr>
-          <w:del w:id="211" w:author="Pawel KAMINSKI" w:date="2024-06-18T11:04:00Z"/>
+          <w:del w:id="214" w:author="Pawel KAMINSKI" w:date="2024-06-18T11:04:00Z"/>
         </w:rPr>
       </w:pPr>
     </w:p>
@@ -3795,7 +3803,7 @@
       <w:pPr>
         <w:pStyle w:val="BodyText"/>
         <w:rPr>
-          <w:del w:id="212" w:author="Pawel KAMINSKI" w:date="2024-06-18T11:04:00Z"/>
+          <w:del w:id="215" w:author="Pawel KAMINSKI" w:date="2024-06-18T11:04:00Z"/>
         </w:rPr>
       </w:pPr>
     </w:p>
@@ -3803,18 +3811,18 @@
       <w:pPr>
         <w:pStyle w:val="Heading2"/>
         <w:rPr>
-          <w:del w:id="213" w:author="Pawel KAMINSKI" w:date="2024-06-03T16:39:00Z"/>
-        </w:rPr>
-      </w:pPr>
-      <w:commentRangeStart w:id="214"/>
-      <w:commentRangeStart w:id="215"/>
-      <w:commentRangeStart w:id="216"/>
-      <w:del w:id="217" w:author="Pawel KAMINSKI" w:date="2024-06-03T16:39:00Z">
+          <w:del w:id="216" w:author="Pawel KAMINSKI" w:date="2024-06-03T16:39:00Z"/>
+        </w:rPr>
+      </w:pPr>
+      <w:commentRangeStart w:id="217"/>
+      <w:commentRangeStart w:id="218"/>
+      <w:commentRangeStart w:id="219"/>
+      <w:del w:id="220" w:author="Pawel KAMINSKI" w:date="2024-06-03T16:39:00Z">
         <w:r>
           <w:delText xml:space="preserve">Settings </w:delText>
         </w:r>
       </w:del>
-      <w:del w:id="218" w:author="Pawel KAMINSKI" w:date="2024-06-03T12:41:00Z">
+      <w:del w:id="221" w:author="Pawel KAMINSKI" w:date="2024-06-03T12:41:00Z">
         <w:r>
           <w:delText>file</w:delText>
         </w:r>
@@ -3822,26 +3830,26 @@
           <w:delText xml:space="preserve"> </w:delText>
         </w:r>
       </w:del>
-      <w:del w:id="219" w:author="Pawel KAMINSKI" w:date="2024-06-03T16:39:00Z">
+      <w:del w:id="222" w:author="Pawel KAMINSKI" w:date="2024-06-03T16:39:00Z">
         <w:r>
           <w:delText>(`_settings.html`)</w:delText>
         </w:r>
-        <w:commentRangeEnd w:id="214"/>
+        <w:commentRangeEnd w:id="217"/>
         <w:r>
           <w:rPr>
             <w:rStyle w:val="CommentReference"/>
           </w:rPr>
-          <w:commentReference w:id="214"/>
-        </w:r>
-        <w:commentRangeEnd w:id="215"/>
+          <w:commentReference w:id="217"/>
+        </w:r>
+        <w:commentRangeEnd w:id="218"/>
         <w:r>
           <w:rPr>
             <w:rStyle w:val="CommentReference"/>
           </w:rPr>
-          <w:commentReference w:id="215"/>
+          <w:commentReference w:id="218"/>
         </w:r>
       </w:del>
-      <w:commentRangeEnd w:id="216"/>
+      <w:commentRangeEnd w:id="219"/>
       <w:r>
         <w:rPr>
           <w:rStyle w:val="CommentReference"/>
@@ -3850,17 +3858,17 @@
           <w:bCs w:val="0"/>
           <w:color w:val="auto"/>
         </w:rPr>
-        <w:commentReference w:id="216"/>
+        <w:commentReference w:id="219"/>
       </w:r>
     </w:p>
     <w:p>
       <w:pPr>
         <w:pStyle w:val="BodyText"/>
         <w:rPr>
-          <w:del w:id="221" w:author="Pawel KAMINSKI" w:date="2024-06-03T16:39:00Z"/>
-        </w:rPr>
-      </w:pPr>
-      <w:del w:id="222" w:author="Pawel KAMINSKI" w:date="2024-06-03T16:39:00Z">
+          <w:del w:id="224" w:author="Pawel KAMINSKI" w:date="2024-06-03T16:39:00Z"/>
+        </w:rPr>
+      </w:pPr>
+      <w:del w:id="225" w:author="Pawel KAMINSKI" w:date="2024-06-03T16:39:00Z">
         <w:r>
           <w:delText xml:space="preserve">:::{card} TODO </w:delText>
         </w:r>
@@ -3909,12 +3917,12 @@
           <w:numId w:val="32"/>
         </w:numPr>
       </w:pPr>
-      <w:del w:id="223" w:author="Pawel KAMINSKI" w:date="2024-06-03T16:41:00Z">
+      <w:del w:id="226" w:author="Pawel KAMINSKI" w:date="2024-06-03T16:41:00Z">
         <w:r>
           <w:delText xml:space="preserve">file </w:delText>
         </w:r>
       </w:del>
-      <w:ins w:id="224" w:author="Pawel KAMINSKI" w:date="2024-06-03T16:41:00Z">
+      <w:ins w:id="227" w:author="Pawel KAMINSKI" w:date="2024-06-03T16:41:00Z">
         <w:r>
           <w:t xml:space="preserve">File </w:t>
         </w:r>
@@ -3922,7 +3930,7 @@
       <w:r>
         <w:t>names should not be too long</w:t>
       </w:r>
-      <w:ins w:id="225" w:author="Pawel KAMINSKI" w:date="2024-06-03T16:42:00Z">
+      <w:ins w:id="228" w:author="Pawel KAMINSKI" w:date="2024-06-03T16:42:00Z">
         <w:r>
           <w:t>.</w:t>
         </w:r>
@@ -3936,12 +3944,12 @@
           <w:numId w:val="32"/>
         </w:numPr>
       </w:pPr>
-      <w:del w:id="226" w:author="Pawel KAMINSKI" w:date="2024-06-03T16:41:00Z">
+      <w:del w:id="229" w:author="Pawel KAMINSKI" w:date="2024-06-03T16:41:00Z">
         <w:r>
           <w:delText xml:space="preserve">only </w:delText>
         </w:r>
       </w:del>
-      <w:ins w:id="227" w:author="Pawel KAMINSKI" w:date="2024-06-03T16:41:00Z">
+      <w:ins w:id="230" w:author="Pawel KAMINSKI" w:date="2024-06-03T16:41:00Z">
         <w:r>
           <w:t xml:space="preserve">Only </w:t>
         </w:r>
@@ -3949,7 +3957,7 @@
       <w:r>
         <w:t>`</w:t>
       </w:r>
-      <w:ins w:id="228" w:author="Pawel KAMINSKI" w:date="2025-01-06T11:07:00Z">
+      <w:ins w:id="231" w:author="Pawel KAMINSKI" w:date="2025-01-06T11:07:00Z">
         <w:r>
           <w:t>0123456789</w:t>
         </w:r>
@@ -3975,7 +3983,7 @@
       <w:r>
         <w:t>characters are allowed</w:t>
       </w:r>
-      <w:ins w:id="229" w:author="Pawel KAMINSKI" w:date="2024-06-03T16:42:00Z">
+      <w:ins w:id="232" w:author="Pawel KAMINSKI" w:date="2024-06-03T16:42:00Z">
         <w:r>
           <w:t>.</w:t>
         </w:r>
@@ -3989,7 +3997,7 @@
           <w:numId w:val="32"/>
         </w:numPr>
       </w:pPr>
-      <w:del w:id="230" w:author="Pawel KAMINSKI" w:date="2024-06-03T16:42:00Z">
+      <w:del w:id="233" w:author="Pawel KAMINSKI" w:date="2024-06-03T16:42:00Z">
         <w:r>
           <w:delText>assignment</w:delText>
         </w:r>
@@ -3997,7 +4005,7 @@
           <w:delText xml:space="preserve"> </w:delText>
         </w:r>
       </w:del>
-      <w:ins w:id="231" w:author="Pawel KAMINSKI" w:date="2024-06-03T16:42:00Z">
+      <w:ins w:id="234" w:author="Pawel KAMINSKI" w:date="2024-06-03T16:42:00Z">
         <w:r>
           <w:t xml:space="preserve">Assignment </w:t>
         </w:r>
@@ -4005,7 +4013,7 @@
       <w:r>
         <w:t>should be clear and precise</w:t>
       </w:r>
-      <w:ins w:id="232" w:author="Pawel KAMINSKI" w:date="2024-06-03T16:42:00Z">
+      <w:ins w:id="235" w:author="Pawel KAMINSKI" w:date="2024-06-03T16:42:00Z">
         <w:r>
           <w:t>.</w:t>
         </w:r>
@@ -4015,7 +4023,7 @@
       <w:pPr>
         <w:pStyle w:val="BodyText"/>
         <w:rPr>
-          <w:ins w:id="233" w:author="Pawel KAMINSKI" w:date="2024-06-04T10:13:00Z"/>
+          <w:ins w:id="236" w:author="Pawel KAMINSKI" w:date="2024-06-04T10:13:00Z"/>
         </w:rPr>
       </w:pPr>
     </w:p>
@@ -4024,25 +4032,25 @@
         <w:pStyle w:val="BodyText"/>
         <w:jc w:val="both"/>
         <w:rPr>
-          <w:ins w:id="234" w:author="Pawel KAMINSKI" w:date="2024-06-04T10:14:00Z"/>
-        </w:rPr>
-        <w:pPrChange w:id="235" w:author="Pawel KAMINSKI" w:date="2024-06-04T10:16:00Z">
+          <w:ins w:id="237" w:author="Pawel KAMINSKI" w:date="2024-06-04T10:14:00Z"/>
+        </w:rPr>
+        <w:pPrChange w:id="238" w:author="Pawel KAMINSKI" w:date="2024-06-04T10:16:00Z">
           <w:pPr>
             <w:pStyle w:val="BodyText"/>
           </w:pPr>
         </w:pPrChange>
       </w:pPr>
-      <w:ins w:id="236" w:author="Pawel KAMINSKI" w:date="2024-06-04T10:13:00Z">
+      <w:ins w:id="239" w:author="Pawel KAMINSKI" w:date="2024-06-04T10:13:00Z">
         <w:r>
           <w:t xml:space="preserve">You can consider </w:t>
         </w:r>
       </w:ins>
-      <w:del w:id="237" w:author="Pawel KAMINSKI" w:date="2024-06-03T16:42:00Z">
+      <w:del w:id="240" w:author="Pawel KAMINSKI" w:date="2024-06-03T16:42:00Z">
         <w:r>
           <w:delText xml:space="preserve">use </w:delText>
         </w:r>
       </w:del>
-      <w:del w:id="238" w:author="Pawel KAMINSKI" w:date="2024-06-04T10:13:00Z">
+      <w:del w:id="241" w:author="Pawel KAMINSKI" w:date="2024-06-04T10:13:00Z">
         <w:r>
           <w:delText xml:space="preserve">a </w:delText>
         </w:r>
@@ -4050,7 +4058,7 @@
       <w:r>
         <w:t xml:space="preserve">numbering </w:t>
       </w:r>
-      <w:ins w:id="239" w:author="Pawel KAMINSKI" w:date="2024-06-04T10:14:00Z">
+      <w:ins w:id="242" w:author="Pawel KAMINSKI" w:date="2024-06-04T10:14:00Z">
         <w:r>
           <w:t xml:space="preserve">your files </w:t>
         </w:r>
@@ -4058,17 +4066,17 @@
       <w:r>
         <w:t>with leading zeros for continuous documents, i.e. 01, 02 …09, 10 or 001 … 020 … 130</w:t>
       </w:r>
-      <w:ins w:id="240" w:author="Pawel KAMINSKI" w:date="2024-06-03T16:41:00Z">
+      <w:ins w:id="243" w:author="Pawel KAMINSKI" w:date="2024-06-03T16:41:00Z">
         <w:r>
           <w:t xml:space="preserve">. </w:t>
         </w:r>
       </w:ins>
-      <w:ins w:id="241" w:author="Pawel KAMINSKI" w:date="2024-06-04T10:14:00Z">
+      <w:ins w:id="244" w:author="Pawel KAMINSKI" w:date="2024-06-04T10:14:00Z">
         <w:r>
           <w:t xml:space="preserve">The main advantage is that your files will be ordered </w:t>
         </w:r>
       </w:ins>
-      <w:ins w:id="242" w:author="Pawel KAMINSKI" w:date="2024-06-04T10:15:00Z">
+      <w:ins w:id="245" w:author="Pawel KAMINSKI" w:date="2024-06-04T10:15:00Z">
         <w:r>
           <w:t xml:space="preserve">in a way you want. The downside is that with every </w:t>
         </w:r>
@@ -4076,17 +4084,17 @@
           <w:t>change in a structure of your book you will have to rename the file</w:t>
         </w:r>
       </w:ins>
-      <w:ins w:id="243" w:author="Pawel KAMINSKI" w:date="2024-06-04T10:16:00Z">
+      <w:ins w:id="246" w:author="Pawel KAMINSKI" w:date="2024-06-04T10:16:00Z">
         <w:r>
           <w:t>s</w:t>
         </w:r>
       </w:ins>
-      <w:ins w:id="244" w:author="Pawel KAMINSKI" w:date="2024-06-04T10:17:00Z">
+      <w:ins w:id="247" w:author="Pawel KAMINSKI" w:date="2024-06-04T10:17:00Z">
         <w:r>
           <w:t xml:space="preserve"> and all the references to them</w:t>
         </w:r>
       </w:ins>
-      <w:ins w:id="245" w:author="Pawel KAMINSKI" w:date="2024-06-04T10:16:00Z">
+      <w:ins w:id="248" w:author="Pawel KAMINSKI" w:date="2024-06-04T10:16:00Z">
         <w:r>
           <w:t>.</w:t>
         </w:r>
@@ -4096,9 +4104,9 @@
       <w:pPr>
         <w:pStyle w:val="BodyText"/>
         <w:rPr>
-          <w:del w:id="246" w:author="Pawel KAMINSKI" w:date="2024-06-04T10:17:00Z"/>
-        </w:rPr>
-        <w:pPrChange w:id="247" w:author="Pawel KAMINSKI" w:date="2024-06-04T10:13:00Z">
+          <w:del w:id="249" w:author="Pawel KAMINSKI" w:date="2024-06-04T10:17:00Z"/>
+        </w:rPr>
+        <w:pPrChange w:id="250" w:author="Pawel KAMINSKI" w:date="2024-06-04T10:13:00Z">
           <w:pPr>
             <w:pStyle w:val="BodyText"/>
             <w:numPr>
@@ -4117,7 +4125,7 @@
     <w:p>
       <w:pPr>
         <w:pStyle w:val="Heading2"/>
-        <w:pPrChange w:id="248" w:author="Pawel KAMINSKI" w:date="2024-06-03T12:38:00Z">
+        <w:pPrChange w:id="251" w:author="Pawel KAMINSKI" w:date="2024-06-03T12:38:00Z">
           <w:pPr>
             <w:pStyle w:val="Heading1"/>
           </w:pPr>
@@ -4135,7 +4143,7 @@
       <w:r>
         <w:t>Please note that it is the author's</w:t>
       </w:r>
-      <w:del w:id="249" w:author="Pawel KAMINSKI" w:date="2025-01-06T11:07:00Z">
+      <w:del w:id="252" w:author="Pawel KAMINSKI" w:date="2025-01-06T11:07:00Z">
         <w:r>
           <w:delText>/editor’s</w:delText>
         </w:r>
@@ -4143,7 +4151,7 @@
       <w:r>
         <w:t xml:space="preserve"> responsibility to obtain usage rights to third-party </w:t>
       </w:r>
-      <w:del w:id="250" w:author="Pawel KAMINSKI" w:date="2025-01-06T11:07:00Z">
+      <w:del w:id="253" w:author="Pawel KAMINSKI" w:date="2025-01-06T11:07:00Z">
         <w:r>
           <w:delText xml:space="preserve">text </w:delText>
         </w:r>
@@ -4151,7 +4159,7 @@
       <w:r>
         <w:t>material,</w:t>
       </w:r>
-      <w:ins w:id="251" w:author="Pawel KAMINSKI" w:date="2025-01-06T11:07:00Z">
+      <w:ins w:id="254" w:author="Pawel KAMINSKI" w:date="2025-01-06T11:07:00Z">
         <w:r>
           <w:t xml:space="preserve"> such as to text,</w:t>
         </w:r>
@@ -4207,7 +4215,7 @@
         <w:pStyle w:val="BodyText"/>
         <w:jc w:val="both"/>
         <w:rPr>
-          <w:ins w:id="252" w:author="Pawel KAMINSKI" w:date="2024-06-03T16:45:00Z"/>
+          <w:ins w:id="255" w:author="Pawel KAMINSKI" w:date="2024-06-03T16:45:00Z"/>
         </w:rPr>
       </w:pPr>
       <w:r>
@@ -4237,13 +4245,13 @@
         <w:pStyle w:val="BodyText"/>
         <w:jc w:val="both"/>
         <w:rPr>
-          <w:ins w:id="253" w:author="Pawel KAMINSKI" w:date="2024-06-18T11:04:00Z"/>
-        </w:rPr>
-      </w:pPr>
-      <w:ins w:id="254" w:author="Pawel KAMINSKI" w:date="2024-06-03T16:45:00Z">
+          <w:ins w:id="256" w:author="Pawel KAMINSKI" w:date="2024-06-18T11:04:00Z"/>
+        </w:rPr>
+      </w:pPr>
+      <w:ins w:id="257" w:author="Pawel KAMINSKI" w:date="2024-06-03T16:45:00Z">
         <w:r>
           <w:rPr>
-            <w:rPrChange w:id="255" w:author="Pawel KAMINSKI" w:date="2024-06-03T16:45:00Z">
+            <w:rPrChange w:id="258" w:author="Pawel KAMINSKI" w:date="2024-06-03T16:45:00Z">
               <w:rPr>
                 <w:lang w:val="fr-FR"/>
               </w:rPr>
@@ -4252,7 +4260,7 @@
           <w:t xml:space="preserve">To obtain the form, </w:t>
         </w:r>
       </w:ins>
-      <w:ins w:id="256" w:author="Pawel KAMINSKI" w:date="2024-06-18T11:04:00Z">
+      <w:ins w:id="259" w:author="Pawel KAMINSKI" w:date="2024-06-18T11:04:00Z">
         <w:r>
           <w:t>write an emai</w:t>
         </w:r>
@@ -4260,12 +4268,12 @@
           <w:t>l to</w:t>
         </w:r>
       </w:ins>
-      <w:ins w:id="257" w:author="verena.deutsch@degruyter.com" w:date="2024-10-08T13:44:00Z">
+      <w:ins w:id="260" w:author="verena.deutsch@degruyter.com" w:date="2024-10-08T13:44:00Z">
         <w:r>
           <w:t xml:space="preserve"> </w:t>
         </w:r>
       </w:ins>
-      <w:ins w:id="258" w:author="Pawel KAMINSKI" w:date="2025-01-06T11:08:00Z">
+      <w:ins w:id="261" w:author="Pawel KAMINSKI" w:date="2025-01-06T11:08:00Z">
         <w:r>
           <w:fldChar w:fldCharType="begin"/>
         </w:r>
@@ -4273,12 +4281,12 @@
           <w:instrText>HYPERLINK "mailto:</w:instrText>
         </w:r>
       </w:ins>
-      <w:ins w:id="259" w:author="verena.deutsch@degruyter.com" w:date="2024-10-08T13:44:00Z">
+      <w:ins w:id="262" w:author="verena.deutsch@degruyter.com" w:date="2024-10-08T13:44:00Z">
         <w:r>
           <w:instrText>verena.deutsch@degruyter.com</w:instrText>
         </w:r>
       </w:ins>
-      <w:ins w:id="260" w:author="Pawel KAMINSKI" w:date="2025-01-06T11:08:00Z">
+      <w:ins w:id="263" w:author="Pawel KAMINSKI" w:date="2025-01-06T11:08:00Z">
         <w:r>
           <w:instrText>"</w:instrText>
         </w:r>
@@ -4286,7 +4294,7 @@
           <w:fldChar w:fldCharType="separate"/>
         </w:r>
       </w:ins>
-      <w:ins w:id="261" w:author="verena.deutsch@degruyter.com" w:date="2024-10-08T13:44:00Z">
+      <w:ins w:id="264" w:author="verena.deutsch@degruyter.com" w:date="2024-10-08T13:44:00Z">
         <w:r>
           <w:rPr>
             <w:rStyle w:val="Hyperlink"/>
@@ -4294,19 +4302,19 @@
           <w:t>verena.deutsch@degruyter.com</w:t>
         </w:r>
       </w:ins>
-      <w:ins w:id="262" w:author="Pawel KAMINSKI" w:date="2025-01-06T11:08:00Z">
+      <w:ins w:id="265" w:author="Pawel KAMINSKI" w:date="2025-01-06T11:08:00Z">
         <w:r>
           <w:fldChar w:fldCharType="end"/>
         </w:r>
       </w:ins>
-      <w:ins w:id="263" w:author="Pawel KAMINSKI" w:date="2024-10-08T15:44:00Z">
-        <w:del w:id="264" w:author="verena.deutsch@degruyter.com" w:date="2024-10-08T13:44:00Z">
+      <w:ins w:id="266" w:author="Pawel KAMINSKI" w:date="2024-10-08T15:44:00Z">
+        <w:del w:id="267" w:author="verena.deutsch@degruyter.com" w:date="2024-10-08T13:44:00Z">
           <w:r>
             <w:delText xml:space="preserve"> </w:delText>
           </w:r>
         </w:del>
       </w:ins>
-      <w:ins w:id="265" w:author="Pawel KAMINSKI" w:date="2024-06-18T11:04:00Z">
+      <w:ins w:id="268" w:author="Pawel KAMINSKI" w:date="2024-06-18T11:04:00Z">
         <w:r>
           <w:t>.</w:t>
         </w:r>
@@ -4317,7 +4325,7 @@
         <w:pStyle w:val="BodyText"/>
         <w:jc w:val="both"/>
         <w:rPr>
-          <w:del w:id="266" w:author="Pawel KAMINSKI" w:date="2024-06-03T16:45:00Z"/>
+          <w:del w:id="269" w:author="Pawel KAMINSKI" w:date="2024-06-03T16:45:00Z"/>
         </w:rPr>
       </w:pPr>
     </w:p>
@@ -4325,10 +4333,10 @@
       <w:pPr>
         <w:pStyle w:val="BodyText"/>
         <w:rPr>
-          <w:del w:id="267" w:author="Pawel KAMINSKI" w:date="2024-06-03T16:45:00Z"/>
-        </w:rPr>
-      </w:pPr>
-      <w:del w:id="268" w:author="Pawel KAMINSKI" w:date="2024-06-03T16:45:00Z">
+          <w:del w:id="270" w:author="Pawel KAMINSKI" w:date="2024-06-03T16:45:00Z"/>
+        </w:rPr>
+      </w:pPr>
+      <w:del w:id="271" w:author="Pawel KAMINSKI" w:date="2024-06-03T16:45:00Z">
         <w:r>
           <w:delText xml:space="preserve">:::{card} TODO </w:delText>
         </w:r>
@@ -4341,35 +4349,35 @@
         <w:r>
           <w:br/>
         </w:r>
-        <w:commentRangeStart w:id="269"/>
-        <w:commentRangeStart w:id="270"/>
-        <w:commentRangeStart w:id="271"/>
+        <w:commentRangeStart w:id="272"/>
+        <w:commentRangeStart w:id="273"/>
+        <w:commentRangeStart w:id="274"/>
         <w:r>
           <w:delText>Add a link to the form.</w:delText>
         </w:r>
-        <w:commentRangeEnd w:id="269"/>
+        <w:commentRangeEnd w:id="272"/>
         <w:r>
           <w:rPr>
             <w:rStyle w:val="CommentReference"/>
           </w:rPr>
-          <w:commentReference w:id="269"/>
-        </w:r>
-        <w:commentRangeEnd w:id="270"/>
+          <w:commentReference w:id="272"/>
+        </w:r>
+        <w:commentRangeEnd w:id="273"/>
         <w:r>
           <w:rPr>
             <w:rStyle w:val="CommentReference"/>
           </w:rPr>
-          <w:commentReference w:id="270"/>
+          <w:commentReference w:id="273"/>
         </w:r>
       </w:del>
-      <w:commentRangeEnd w:id="271"/>
+      <w:commentRangeEnd w:id="274"/>
       <w:r>
         <w:rPr>
           <w:rStyle w:val="CommentReference"/>
         </w:rPr>
-        <w:commentReference w:id="271"/>
-      </w:r>
-      <w:del w:id="273" w:author="Pawel KAMINSKI" w:date="2024-06-03T16:45:00Z">
+        <w:commentReference w:id="274"/>
+      </w:r>
+      <w:del w:id="276" w:author="Pawel KAMINSKI" w:date="2024-06-03T16:45:00Z">
         <w:r>
           <w:br/>
           <w:delText>:::</w:delText>
@@ -4384,14 +4392,13 @@
     <w:p>
       <w:pPr>
         <w:pStyle w:val="Heading2"/>
-        <w:pPrChange w:id="274" w:author="Pawel KAMINSKI" w:date="2024-06-03T12:38:00Z">
+        <w:pPrChange w:id="277" w:author="Pawel KAMINSKI" w:date="2024-06-03T12:38:00Z">
           <w:pPr>
             <w:pStyle w:val="Heading1"/>
           </w:pPr>
         </w:pPrChange>
       </w:pPr>
       <w:r>
-        <w:lastRenderedPageBreak/>
         <w:t>Uniform Formatting</w:t>
       </w:r>
     </w:p>
@@ -4400,18 +4407,18 @@
         <w:pStyle w:val="BodyText"/>
         <w:jc w:val="both"/>
         <w:rPr>
-          <w:del w:id="275" w:author="Pawel KAMINSKI" w:date="2024-06-03T16:57:00Z"/>
+          <w:del w:id="278" w:author="Pawel KAMINSKI" w:date="2024-06-03T16:57:00Z"/>
         </w:rPr>
       </w:pPr>
       <w:r>
         <w:t xml:space="preserve">As the author, you are responsible for the uniform formatting of your manuscript. If several individuals were involved in drafting </w:t>
       </w:r>
-      <w:del w:id="276" w:author="Pawel KAMINSKI" w:date="2024-06-03T16:57:00Z">
+      <w:del w:id="279" w:author="Pawel KAMINSKI" w:date="2024-06-03T16:57:00Z">
         <w:r>
           <w:delText>the manuscript</w:delText>
         </w:r>
       </w:del>
-      <w:ins w:id="277" w:author="Pawel KAMINSKI" w:date="2024-06-03T16:57:00Z">
+      <w:ins w:id="280" w:author="Pawel KAMINSKI" w:date="2024-06-03T16:57:00Z">
         <w:r>
           <w:t>a single volume</w:t>
         </w:r>
@@ -4425,7 +4432,7 @@
       <w:r>
         <w:t xml:space="preserve"> for an anthology), please make sure that all articles have the same format, both in terms of layout, style, and spelling.</w:t>
       </w:r>
-      <w:ins w:id="278" w:author="Pawel KAMINSKI" w:date="2024-12-13T11:38:00Z">
+      <w:ins w:id="281" w:author="Pawel KAMINSKI" w:date="2024-12-13T11:38:00Z">
         <w:r>
           <w:t xml:space="preserve"> </w:t>
         </w:r>
@@ -4479,59 +4486,59 @@
       <w:r>
         <w:t>If the manuscript is in English, either American or British English may be used, but spelling should be uniform throughout the</w:t>
       </w:r>
-      <w:ins w:id="279" w:author="Pawel KAMINSKI" w:date="2024-06-04T10:11:00Z">
+      <w:ins w:id="282" w:author="Pawel KAMINSKI" w:date="2024-06-04T10:11:00Z">
         <w:r>
           <w:t xml:space="preserve"> </w:t>
         </w:r>
       </w:ins>
-      <w:ins w:id="280" w:author="Pawel KAMINSKI" w:date="2024-06-04T10:12:00Z">
+      <w:ins w:id="283" w:author="Pawel KAMINSKI" w:date="2024-06-04T10:12:00Z">
         <w:r>
           <w:t xml:space="preserve">whole </w:t>
         </w:r>
       </w:ins>
-      <w:ins w:id="281" w:author="Pawel KAMINSKI" w:date="2024-06-04T10:11:00Z">
+      <w:ins w:id="284" w:author="Pawel KAMINSKI" w:date="2024-06-04T10:11:00Z">
         <w:r>
           <w:t>volume</w:t>
         </w:r>
       </w:ins>
-      <w:del w:id="282" w:author="Pawel KAMINSKI" w:date="2024-06-04T10:11:00Z">
+      <w:del w:id="285" w:author="Pawel KAMINSKI" w:date="2024-06-04T10:11:00Z">
         <w:r>
           <w:delText xml:space="preserve"> monograph</w:delText>
         </w:r>
       </w:del>
-      <w:commentRangeStart w:id="283"/>
-      <w:commentRangeStart w:id="284"/>
-      <w:commentRangeStart w:id="285"/>
-      <w:del w:id="286" w:author="Pawel KAMINSKI" w:date="2024-06-03T16:49:00Z">
+      <w:commentRangeStart w:id="286"/>
+      <w:commentRangeStart w:id="287"/>
+      <w:commentRangeStart w:id="288"/>
+      <w:del w:id="289" w:author="Pawel KAMINSKI" w:date="2024-06-03T16:49:00Z">
         <w:r>
           <w:delText>, contribution or single articles</w:delText>
         </w:r>
-        <w:commentRangeEnd w:id="283"/>
+        <w:commentRangeEnd w:id="286"/>
         <w:r>
           <w:rPr>
             <w:rStyle w:val="CommentReference"/>
           </w:rPr>
-          <w:commentReference w:id="283"/>
-        </w:r>
-        <w:commentRangeEnd w:id="284"/>
+          <w:commentReference w:id="286"/>
+        </w:r>
+        <w:commentRangeEnd w:id="287"/>
         <w:r>
           <w:rPr>
             <w:rStyle w:val="CommentReference"/>
           </w:rPr>
-          <w:commentReference w:id="284"/>
+          <w:commentReference w:id="287"/>
         </w:r>
       </w:del>
-      <w:commentRangeEnd w:id="285"/>
+      <w:commentRangeEnd w:id="288"/>
       <w:r>
         <w:rPr>
           <w:rStyle w:val="CommentReference"/>
         </w:rPr>
-        <w:commentReference w:id="285"/>
+        <w:commentReference w:id="288"/>
       </w:r>
       <w:r>
         <w:t xml:space="preserve">. </w:t>
       </w:r>
-      <w:ins w:id="288" w:author="Pawel KAMINSKI" w:date="2024-06-03T16:51:00Z">
+      <w:ins w:id="291" w:author="Pawel KAMINSKI" w:date="2024-06-03T16:51:00Z">
         <w:r>
           <w:t xml:space="preserve"> </w:t>
         </w:r>
@@ -4589,6 +4596,7 @@
         <w:jc w:val="both"/>
       </w:pPr>
       <w:r>
+        <w:lastRenderedPageBreak/>
         <w:t>Punctuation according to the used language:</w:t>
       </w:r>
     </w:p>
@@ -4709,7 +4717,7 @@
         <w:pStyle w:val="BodyText"/>
         <w:jc w:val="both"/>
         <w:rPr>
-          <w:ins w:id="289" w:author="Deutsch, Verena" w:date="2024-04-16T16:46:00Z"/>
+          <w:ins w:id="292" w:author="Deutsch, Verena" w:date="2024-04-16T16:46:00Z"/>
         </w:rPr>
       </w:pPr>
       <w:r>
@@ -4724,12 +4732,12 @@
       <w:r>
         <w:t xml:space="preserve">Uniform spelling: </w:t>
       </w:r>
-      <w:ins w:id="290" w:author="Pawel KAMINSKI" w:date="2025-02-27T13:55:00Z" w16du:dateUtc="2025-02-27T12:55:00Z">
+      <w:ins w:id="293" w:author="Pawel KAMINSKI" w:date="2025-02-27T13:55:00Z" w16du:dateUtc="2025-02-27T12:55:00Z">
         <w:r>
           <w:t>a</w:t>
         </w:r>
       </w:ins>
-      <w:del w:id="291" w:author="Pawel KAMINSKI" w:date="2025-02-27T13:55:00Z" w16du:dateUtc="2025-02-27T12:55:00Z">
+      <w:del w:id="294" w:author="Pawel KAMINSKI" w:date="2025-02-27T13:55:00Z" w16du:dateUtc="2025-02-27T12:55:00Z">
         <w:r>
           <w:delText>A</w:delText>
         </w:r>
@@ -4737,12 +4745,12 @@
       <w:r>
         <w:t xml:space="preserve">bbreviations (i.e. fig., tab.), </w:t>
       </w:r>
-      <w:ins w:id="292" w:author="Deutsch, Verena" w:date="2024-04-16T16:46:00Z">
+      <w:ins w:id="295" w:author="Deutsch, Verena" w:date="2024-04-16T16:46:00Z">
         <w:r>
           <w:t>f</w:t>
         </w:r>
       </w:ins>
-      <w:del w:id="293" w:author="Deutsch, Verena" w:date="2024-04-16T16:46:00Z">
+      <w:del w:id="296" w:author="Deutsch, Verena" w:date="2024-04-16T16:46:00Z">
         <w:r>
           <w:delText>F</w:delText>
         </w:r>
@@ -4775,24 +4783,24 @@
     <w:p>
       <w:pPr>
         <w:pStyle w:val="Heading2"/>
-        <w:pPrChange w:id="294" w:author="Pawel KAMINSKI" w:date="2024-06-03T12:39:00Z">
+        <w:pPrChange w:id="297" w:author="Pawel KAMINSKI" w:date="2024-06-03T12:39:00Z">
           <w:pPr>
             <w:pStyle w:val="Heading1"/>
           </w:pPr>
         </w:pPrChange>
       </w:pPr>
-      <w:commentRangeStart w:id="295"/>
-      <w:commentRangeStart w:id="296"/>
-      <w:commentRangeStart w:id="297"/>
+      <w:commentRangeStart w:id="298"/>
+      <w:commentRangeStart w:id="299"/>
+      <w:commentRangeStart w:id="300"/>
       <w:r>
         <w:t xml:space="preserve">Please Avoid </w:t>
       </w:r>
-      <w:ins w:id="298" w:author="Pawel KAMINSKI" w:date="2025-01-17T15:12:00Z">
+      <w:ins w:id="301" w:author="Pawel KAMINSKI" w:date="2025-01-17T15:12:00Z">
         <w:r>
           <w:t>T</w:t>
         </w:r>
       </w:ins>
-      <w:del w:id="299" w:author="Pawel KAMINSKI" w:date="2025-01-17T15:12:00Z">
+      <w:del w:id="302" w:author="Pawel KAMINSKI" w:date="2025-01-17T15:12:00Z">
         <w:r>
           <w:delText>t</w:delText>
         </w:r>
@@ -4800,21 +4808,21 @@
       <w:r>
         <w:t>he Following</w:t>
       </w:r>
-      <w:commentRangeEnd w:id="295"/>
+      <w:commentRangeEnd w:id="298"/>
       <w:r>
         <w:rPr>
           <w:rStyle w:val="CommentReference"/>
         </w:rPr>
-        <w:commentReference w:id="295"/>
-      </w:r>
-      <w:commentRangeEnd w:id="296"/>
+        <w:commentReference w:id="298"/>
+      </w:r>
+      <w:commentRangeEnd w:id="299"/>
       <w:r>
         <w:rPr>
           <w:rStyle w:val="CommentReference"/>
         </w:rPr>
-        <w:commentReference w:id="296"/>
-      </w:r>
-      <w:commentRangeEnd w:id="297"/>
+        <w:commentReference w:id="299"/>
+      </w:r>
+      <w:commentRangeEnd w:id="300"/>
       <w:r>
         <w:rPr>
           <w:rStyle w:val="CommentReference"/>
@@ -4823,7 +4831,7 @@
           <w:bCs w:val="0"/>
           <w:color w:val="auto"/>
         </w:rPr>
-        <w:commentReference w:id="297"/>
+        <w:commentReference w:id="300"/>
       </w:r>
     </w:p>
     <w:p>
@@ -4911,7 +4919,6 @@
         </w:numPr>
       </w:pPr>
       <w:r>
-        <w:lastRenderedPageBreak/>
         <w:t>Referencing pages.</w:t>
       </w:r>
     </w:p>
@@ -4982,7 +4989,7 @@
       <w:pPr>
         <w:pStyle w:val="BodyText"/>
         <w:rPr>
-          <w:ins w:id="301" w:author="Pawel KAMINSKI" w:date="2025-02-03T13:45:00Z"/>
+          <w:ins w:id="304" w:author="Pawel KAMINSKI" w:date="2025-02-03T13:45:00Z"/>
         </w:rPr>
       </w:pPr>
     </w:p>
@@ -4990,7 +4997,7 @@
       <w:pPr>
         <w:pStyle w:val="BodyText"/>
         <w:rPr>
-          <w:ins w:id="302" w:author="Pawel KAMINSKI" w:date="2025-02-03T13:45:00Z"/>
+          <w:ins w:id="305" w:author="Pawel KAMINSKI" w:date="2025-02-03T13:45:00Z"/>
         </w:rPr>
       </w:pPr>
     </w:p>
@@ -4998,7 +5005,7 @@
       <w:pPr>
         <w:pStyle w:val="BodyText"/>
         <w:rPr>
-          <w:ins w:id="303" w:author="Pawel KAMINSKI" w:date="2025-02-03T13:45:00Z"/>
+          <w:ins w:id="306" w:author="Pawel KAMINSKI" w:date="2025-02-03T13:45:00Z"/>
         </w:rPr>
       </w:pPr>
     </w:p>
@@ -5006,7 +5013,7 @@
       <w:pPr>
         <w:pStyle w:val="BodyText"/>
         <w:rPr>
-          <w:ins w:id="304" w:author="Pawel KAMINSKI" w:date="2025-02-03T13:45:00Z"/>
+          <w:ins w:id="307" w:author="Pawel KAMINSKI" w:date="2025-02-03T13:45:00Z"/>
         </w:rPr>
       </w:pPr>
     </w:p>
@@ -5014,7 +5021,7 @@
       <w:pPr>
         <w:pStyle w:val="BodyText"/>
         <w:rPr>
-          <w:ins w:id="305" w:author="Pawel KAMINSKI" w:date="2025-02-03T13:45:00Z"/>
+          <w:ins w:id="308" w:author="Pawel KAMINSKI" w:date="2025-02-03T13:45:00Z"/>
         </w:rPr>
       </w:pPr>
     </w:p>
@@ -5022,7 +5029,7 @@
       <w:pPr>
         <w:pStyle w:val="BodyText"/>
         <w:rPr>
-          <w:ins w:id="306" w:author="Pawel KAMINSKI" w:date="2025-02-03T13:45:00Z"/>
+          <w:ins w:id="309" w:author="Pawel KAMINSKI" w:date="2025-02-03T13:45:00Z"/>
         </w:rPr>
       </w:pPr>
     </w:p>
@@ -5030,7 +5037,7 @@
       <w:pPr>
         <w:pStyle w:val="BodyText"/>
         <w:rPr>
-          <w:ins w:id="307" w:author="Pawel KAMINSKI" w:date="2025-02-03T13:45:00Z"/>
+          <w:ins w:id="310" w:author="Pawel KAMINSKI" w:date="2025-02-03T13:45:00Z"/>
         </w:rPr>
       </w:pPr>
     </w:p>
@@ -5464,7 +5471,7 @@
       </w:r>
     </w:p>
   </w:comment>
-  <w:comment w:id="19" w:author="Gabor Mihaly TOTH" w:date="2024-05-28T09:16:00Z" w:initials="GT">
+  <w:comment w:id="21" w:author="Gabor Mihaly TOTH" w:date="2024-05-28T09:16:00Z" w:initials="GT">
     <w:p>
       <w:pPr>
         <w:pStyle w:val="CommentText"/>
@@ -5481,11 +5488,11 @@
       <w:r>
         <w:instrText xml:space="preserve"> HYPERLINK "mailto:pawel.kaminski@uni.lu"</w:instrText>
       </w:r>
-      <w:bookmarkStart w:id="21" w:name="_@_644EFA51C0F348F2ADD59591E5F5DAE1Z"/>
+      <w:bookmarkStart w:id="23" w:name="_@_644EFA51C0F348F2ADD59591E5F5DAE1Z"/>
       <w:r>
         <w:fldChar w:fldCharType="separate"/>
       </w:r>
-      <w:bookmarkEnd w:id="21"/>
+      <w:bookmarkEnd w:id="23"/>
       <w:r>
         <w:rPr>
           <w:rStyle w:val="Mention"/>
@@ -5501,7 +5508,7 @@
       </w:r>
     </w:p>
   </w:comment>
-  <w:comment w:id="20" w:author="Pawel KAMINSKI" w:date="2024-06-03T17:01:00Z" w:initials="PK">
+  <w:comment w:id="22" w:author="Pawel KAMINSKI" w:date="2024-06-03T17:01:00Z" w:initials="PK">
     <w:p>
       <w:pPr>
         <w:pStyle w:val="CommentText"/>
@@ -5517,7 +5524,7 @@
       </w:r>
     </w:p>
   </w:comment>
-  <w:comment w:id="23" w:author="Deutsch, Verena" w:date="2024-04-29T15:43:00Z" w:initials="DV">
+  <w:comment w:id="25" w:author="Deutsch, Verena" w:date="2024-04-29T15:43:00Z" w:initials="DV">
     <w:p>
       <w:pPr>
         <w:pStyle w:val="CommentText"/>
@@ -5533,7 +5540,7 @@
       </w:r>
     </w:p>
   </w:comment>
-  <w:comment w:id="24" w:author="Gabor Mihaly TOTH" w:date="2024-05-28T09:19:00Z" w:initials="GT">
+  <w:comment w:id="26" w:author="Gabor Mihaly TOTH" w:date="2024-05-28T09:19:00Z" w:initials="GT">
     <w:p>
       <w:pPr>
         <w:pStyle w:val="CommentText"/>
@@ -5550,11 +5557,11 @@
       <w:r>
         <w:instrText xml:space="preserve"> HYPERLINK "mailto:pawel.kaminski@uni.lu"</w:instrText>
       </w:r>
-      <w:bookmarkStart w:id="28" w:name="_@_A7DA70355AD841BC96466F04868BBCB6Z"/>
+      <w:bookmarkStart w:id="30" w:name="_@_A7DA70355AD841BC96466F04868BBCB6Z"/>
       <w:r>
         <w:fldChar w:fldCharType="separate"/>
       </w:r>
-      <w:bookmarkEnd w:id="28"/>
+      <w:bookmarkEnd w:id="30"/>
       <w:r>
         <w:rPr>
           <w:rStyle w:val="Mention"/>
@@ -5575,7 +5582,7 @@
       </w:pPr>
     </w:p>
   </w:comment>
-  <w:comment w:id="74" w:author="Gabor Mihaly TOTH" w:date="2024-05-28T09:17:00Z" w:initials="GT">
+  <w:comment w:id="77" w:author="Gabor Mihaly TOTH" w:date="2024-05-28T09:17:00Z" w:initials="GT">
     <w:p>
       <w:pPr>
         <w:pStyle w:val="CommentText"/>
@@ -5595,11 +5602,11 @@
       <w:r>
         <w:instrText xml:space="preserve"> HYPERLINK "mailto:pawel.kaminski@uni.lu"</w:instrText>
       </w:r>
-      <w:bookmarkStart w:id="76" w:name="_@_F5882CB9CDD9432B93D00495DC05A8F9Z"/>
+      <w:bookmarkStart w:id="79" w:name="_@_F5882CB9CDD9432B93D00495DC05A8F9Z"/>
       <w:r>
         <w:fldChar w:fldCharType="separate"/>
       </w:r>
-      <w:bookmarkEnd w:id="76"/>
+      <w:bookmarkEnd w:id="79"/>
       <w:r>
         <w:rPr>
           <w:rStyle w:val="Mention"/>
@@ -5615,7 +5622,7 @@
       </w:r>
     </w:p>
   </w:comment>
-  <w:comment w:id="75" w:author="Pawel KAMINSKI" w:date="2024-06-03T16:27:00Z" w:initials="PK">
+  <w:comment w:id="78" w:author="Pawel KAMINSKI" w:date="2024-06-03T16:27:00Z" w:initials="PK">
     <w:p>
       <w:pPr>
         <w:pStyle w:val="CommentText"/>
@@ -5631,7 +5638,7 @@
       </w:r>
     </w:p>
   </w:comment>
-  <w:comment w:id="120" w:author="Deutsch, Verena" w:date="2024-04-29T15:43:00Z" w:initials="DV">
+  <w:comment w:id="123" w:author="Deutsch, Verena" w:date="2024-04-29T15:43:00Z" w:initials="DV">
     <w:p>
       <w:pPr>
         <w:pStyle w:val="CommentText"/>
@@ -5658,7 +5665,7 @@
       </w:r>
     </w:p>
   </w:comment>
-  <w:comment w:id="121" w:author="Gabor Mihaly TOTH" w:date="2024-05-28T09:19:00Z" w:initials="GT">
+  <w:comment w:id="124" w:author="Gabor Mihaly TOTH" w:date="2024-05-28T09:19:00Z" w:initials="GT">
     <w:p>
       <w:pPr>
         <w:pStyle w:val="CommentText"/>
@@ -5675,11 +5682,11 @@
       <w:r>
         <w:instrText xml:space="preserve"> HYPERLINK "mailto:pawel.kaminski@uni.lu"</w:instrText>
       </w:r>
-      <w:bookmarkStart w:id="123" w:name="_@_140873DA907049049D6D0DE8CEBEC2EAZ"/>
+      <w:bookmarkStart w:id="126" w:name="_@_140873DA907049049D6D0DE8CEBEC2EAZ"/>
       <w:r>
         <w:fldChar w:fldCharType="separate"/>
       </w:r>
-      <w:bookmarkEnd w:id="123"/>
+      <w:bookmarkEnd w:id="126"/>
       <w:r>
         <w:rPr>
           <w:rStyle w:val="Mention"/>
@@ -5695,7 +5702,7 @@
       </w:r>
     </w:p>
   </w:comment>
-  <w:comment w:id="122" w:author="Pawel KAMINSKI" w:date="2024-06-03T12:55:00Z" w:initials="PK">
+  <w:comment w:id="125" w:author="Pawel KAMINSKI" w:date="2024-06-03T12:55:00Z" w:initials="PK">
     <w:p>
       <w:pPr>
         <w:pStyle w:val="CommentText"/>
@@ -5711,7 +5718,7 @@
       </w:r>
     </w:p>
   </w:comment>
-  <w:comment w:id="124" w:author="Deutsch, Verena [2]" w:date="2024-04-16T16:28:00Z" w:initials="DV">
+  <w:comment w:id="127" w:author="Deutsch, Verena [2]" w:date="2024-04-16T16:28:00Z" w:initials="DV">
     <w:p>
       <w:pPr>
         <w:pStyle w:val="CommentText"/>
@@ -5727,7 +5734,7 @@
       </w:r>
     </w:p>
   </w:comment>
-  <w:comment w:id="125" w:author="Borlinghaus, Anton" w:date="2024-04-25T11:28:00Z" w:initials="BA">
+  <w:comment w:id="128" w:author="Borlinghaus, Anton" w:date="2024-04-25T11:28:00Z" w:initials="BA">
     <w:p>
       <w:pPr>
         <w:pStyle w:val="CommentText"/>
@@ -5740,7 +5747,7 @@
       </w:r>
     </w:p>
   </w:comment>
-  <w:comment w:id="126" w:author="Gabor Mihaly TOTH" w:date="2024-05-28T09:20:00Z" w:initials="GT">
+  <w:comment w:id="129" w:author="Gabor Mihaly TOTH" w:date="2024-05-28T09:20:00Z" w:initials="GT">
     <w:p>
       <w:pPr>
         <w:pStyle w:val="CommentText"/>
@@ -5757,11 +5764,11 @@
       <w:r>
         <w:instrText xml:space="preserve"> HYPERLINK "mailto:pawel.kaminski@uni.lu"</w:instrText>
       </w:r>
-      <w:bookmarkStart w:id="128" w:name="_@_602860A66D4B4F4DA5D1362C81E01409Z"/>
+      <w:bookmarkStart w:id="131" w:name="_@_602860A66D4B4F4DA5D1362C81E01409Z"/>
       <w:r>
         <w:fldChar w:fldCharType="separate"/>
       </w:r>
-      <w:bookmarkEnd w:id="128"/>
+      <w:bookmarkEnd w:id="131"/>
       <w:r>
         <w:rPr>
           <w:rStyle w:val="Mention"/>
@@ -5782,7 +5789,7 @@
       </w:pPr>
     </w:p>
   </w:comment>
-  <w:comment w:id="127" w:author="Pawel KAMINSKI" w:date="2024-06-03T15:25:00Z" w:initials="PK">
+  <w:comment w:id="130" w:author="Pawel KAMINSKI" w:date="2024-06-03T15:25:00Z" w:initials="PK">
     <w:p>
       <w:pPr>
         <w:pStyle w:val="CommentText"/>
@@ -5798,7 +5805,7 @@
       </w:r>
     </w:p>
   </w:comment>
-  <w:comment w:id="140" w:author="Borlinghaus, Anton" w:date="2024-04-30T16:02:00Z" w:initials="BA">
+  <w:comment w:id="143" w:author="Borlinghaus, Anton" w:date="2024-04-30T16:02:00Z" w:initials="BA">
     <w:p>
       <w:pPr>
         <w:pStyle w:val="CommentText"/>
@@ -5814,7 +5821,7 @@
       </w:r>
     </w:p>
   </w:comment>
-  <w:comment w:id="141" w:author="Pawel KAMINSKI" w:date="2024-06-03T16:28:00Z" w:initials="PK">
+  <w:comment w:id="144" w:author="Pawel KAMINSKI" w:date="2024-06-03T16:28:00Z" w:initials="PK">
     <w:p>
       <w:pPr>
         <w:pStyle w:val="CommentText"/>
@@ -5830,7 +5837,7 @@
       </w:r>
     </w:p>
   </w:comment>
-  <w:comment w:id="142" w:author="Deutsch, Verena [2]" w:date="2024-04-16T16:28:00Z" w:initials="DV">
+  <w:comment w:id="145" w:author="Deutsch, Verena [2]" w:date="2024-04-16T16:28:00Z" w:initials="DV">
     <w:p>
       <w:pPr>
         <w:pStyle w:val="CommentText"/>
@@ -5846,7 +5853,7 @@
       </w:r>
     </w:p>
   </w:comment>
-  <w:comment w:id="143" w:author="Gabor Mihaly TOTH" w:date="2024-05-28T09:20:00Z" w:initials="GT">
+  <w:comment w:id="146" w:author="Gabor Mihaly TOTH" w:date="2024-05-28T09:20:00Z" w:initials="GT">
     <w:p>
       <w:pPr>
         <w:pStyle w:val="CommentText"/>
@@ -5863,11 +5870,11 @@
       <w:r>
         <w:instrText xml:space="preserve"> HYPERLINK "mailto:pawel.kaminski@uni.lu"</w:instrText>
       </w:r>
-      <w:bookmarkStart w:id="145" w:name="_@_4F194CDCBCA1445D874BB412284C17E2Z"/>
+      <w:bookmarkStart w:id="148" w:name="_@_4F194CDCBCA1445D874BB412284C17E2Z"/>
       <w:r>
         <w:fldChar w:fldCharType="separate"/>
       </w:r>
-      <w:bookmarkEnd w:id="145"/>
+      <w:bookmarkEnd w:id="148"/>
       <w:r>
         <w:rPr>
           <w:rStyle w:val="Mention"/>
@@ -5883,7 +5890,7 @@
       </w:r>
     </w:p>
   </w:comment>
-  <w:comment w:id="144" w:author="Pawel KAMINSKI" w:date="2024-06-03T16:28:00Z" w:initials="PK">
+  <w:comment w:id="147" w:author="Pawel KAMINSKI" w:date="2024-06-03T16:28:00Z" w:initials="PK">
     <w:p>
       <w:pPr>
         <w:pStyle w:val="CommentText"/>
@@ -5899,7 +5906,7 @@
       </w:r>
     </w:p>
   </w:comment>
-  <w:comment w:id="157" w:author="Deutsch, Verena [2]" w:date="2024-04-16T16:28:00Z" w:initials="DV">
+  <w:comment w:id="160" w:author="Deutsch, Verena [2]" w:date="2024-04-16T16:28:00Z" w:initials="DV">
     <w:p>
       <w:pPr>
         <w:pStyle w:val="CommentText"/>
@@ -5915,7 +5922,7 @@
       </w:r>
     </w:p>
   </w:comment>
-  <w:comment w:id="158" w:author="Gabor Mihaly TOTH" w:date="2024-05-28T09:20:00Z" w:initials="GT">
+  <w:comment w:id="161" w:author="Gabor Mihaly TOTH" w:date="2024-05-28T09:20:00Z" w:initials="GT">
     <w:p>
       <w:pPr>
         <w:pStyle w:val="CommentText"/>
@@ -5932,11 +5939,11 @@
       <w:r>
         <w:instrText xml:space="preserve"> HYPERLINK "mailto:pawel.kaminski@uni.lu"</w:instrText>
       </w:r>
-      <w:bookmarkStart w:id="159" w:name="_@_FBA019012145438CA9C5D3CA4218BDFAZ"/>
+      <w:bookmarkStart w:id="162" w:name="_@_FBA019012145438CA9C5D3CA4218BDFAZ"/>
       <w:r>
         <w:fldChar w:fldCharType="separate"/>
       </w:r>
-      <w:bookmarkEnd w:id="159"/>
+      <w:bookmarkEnd w:id="162"/>
       <w:r>
         <w:rPr>
           <w:rStyle w:val="Mention"/>
@@ -5952,7 +5959,7 @@
       </w:r>
     </w:p>
   </w:comment>
-  <w:comment w:id="160" w:author="Pawel KAMINSKI" w:date="2024-06-03T16:28:00Z" w:initials="PK">
+  <w:comment w:id="163" w:author="Pawel KAMINSKI" w:date="2024-06-03T16:28:00Z" w:initials="PK">
     <w:p>
       <w:pPr>
         <w:pStyle w:val="CommentText"/>
@@ -5968,7 +5975,7 @@
       </w:r>
     </w:p>
   </w:comment>
-  <w:comment w:id="187" w:author="Deutsch, Verena [2]" w:date="2024-04-16T16:31:00Z" w:initials="DV">
+  <w:comment w:id="190" w:author="Deutsch, Verena [2]" w:date="2024-04-16T16:31:00Z" w:initials="DV">
     <w:p>
       <w:pPr>
         <w:pStyle w:val="CommentText"/>
@@ -5991,7 +5998,7 @@
       </w:r>
     </w:p>
   </w:comment>
-  <w:comment w:id="188" w:author="Gabor Mihaly TOTH" w:date="2024-05-28T09:21:00Z" w:initials="GT">
+  <w:comment w:id="191" w:author="Gabor Mihaly TOTH" w:date="2024-05-28T09:21:00Z" w:initials="GT">
     <w:p>
       <w:pPr>
         <w:pStyle w:val="CommentText"/>
@@ -6007,7 +6014,7 @@
       </w:r>
     </w:p>
   </w:comment>
-  <w:comment w:id="203" w:author="Deutsch, Verena [2]" w:date="2024-04-16T16:36:00Z" w:initials="DV">
+  <w:comment w:id="206" w:author="Deutsch, Verena [2]" w:date="2024-04-16T16:36:00Z" w:initials="DV">
     <w:p>
       <w:pPr>
         <w:pStyle w:val="CommentText"/>
@@ -6023,7 +6030,7 @@
       </w:r>
     </w:p>
   </w:comment>
-  <w:comment w:id="204" w:author="Gabor Mihaly TOTH" w:date="2024-05-28T09:22:00Z" w:initials="GT">
+  <w:comment w:id="207" w:author="Gabor Mihaly TOTH" w:date="2024-05-28T09:22:00Z" w:initials="GT">
     <w:p>
       <w:pPr>
         <w:pStyle w:val="CommentText"/>
@@ -6039,7 +6046,7 @@
       </w:r>
     </w:p>
   </w:comment>
-  <w:comment w:id="205" w:author="Pawel KAMINSKI" w:date="2024-06-03T16:38:00Z" w:initials="PK">
+  <w:comment w:id="208" w:author="Pawel KAMINSKI" w:date="2024-06-03T16:38:00Z" w:initials="PK">
     <w:p>
       <w:pPr>
         <w:pStyle w:val="CommentText"/>
@@ -6055,7 +6062,7 @@
       </w:r>
     </w:p>
   </w:comment>
-  <w:comment w:id="214" w:author="Gabor Mihaly TOTH" w:date="2024-05-28T09:23:00Z" w:initials="GT">
+  <w:comment w:id="217" w:author="Gabor Mihaly TOTH" w:date="2024-05-28T09:23:00Z" w:initials="GT">
     <w:p>
       <w:pPr>
         <w:pStyle w:val="CommentText"/>
@@ -6071,7 +6078,7 @@
       </w:r>
     </w:p>
   </w:comment>
-  <w:comment w:id="215" w:author="Gabor Mihaly TOTH" w:date="2024-05-28T09:23:00Z" w:initials="GT">
+  <w:comment w:id="218" w:author="Gabor Mihaly TOTH" w:date="2024-05-28T09:23:00Z" w:initials="GT">
     <w:p>
       <w:pPr>
         <w:pStyle w:val="CommentText"/>
@@ -6088,11 +6095,11 @@
       <w:r>
         <w:instrText xml:space="preserve"> HYPERLINK "mailto:pawel.kaminski@uni.lu"</w:instrText>
       </w:r>
-      <w:bookmarkStart w:id="220" w:name="_@_1C9EBC6A55694D8683E1D1E8CFF5778FZ"/>
+      <w:bookmarkStart w:id="223" w:name="_@_1C9EBC6A55694D8683E1D1E8CFF5778FZ"/>
       <w:r>
         <w:fldChar w:fldCharType="separate"/>
       </w:r>
-      <w:bookmarkEnd w:id="220"/>
+      <w:bookmarkEnd w:id="223"/>
       <w:r>
         <w:rPr>
           <w:rStyle w:val="Mention"/>
@@ -6108,7 +6115,7 @@
       </w:r>
     </w:p>
   </w:comment>
-  <w:comment w:id="216" w:author="Pawel KAMINSKI" w:date="2024-06-03T16:39:00Z" w:initials="PK">
+  <w:comment w:id="219" w:author="Pawel KAMINSKI" w:date="2024-06-03T16:39:00Z" w:initials="PK">
     <w:p>
       <w:pPr>
         <w:pStyle w:val="CommentText"/>
@@ -6124,7 +6131,7 @@
       </w:r>
     </w:p>
   </w:comment>
-  <w:comment w:id="269" w:author="Deutsch, Verena [2]" w:date="2024-04-16T16:39:00Z" w:initials="DV">
+  <w:comment w:id="272" w:author="Deutsch, Verena [2]" w:date="2024-04-16T16:39:00Z" w:initials="DV">
     <w:p>
       <w:pPr>
         <w:pStyle w:val="CommentText"/>
@@ -6140,7 +6147,7 @@
       </w:r>
     </w:p>
   </w:comment>
-  <w:comment w:id="270" w:author="Gabor Mihaly TOTH" w:date="2024-05-28T09:24:00Z" w:initials="GT">
+  <w:comment w:id="273" w:author="Gabor Mihaly TOTH" w:date="2024-05-28T09:24:00Z" w:initials="GT">
     <w:p>
       <w:pPr>
         <w:pStyle w:val="CommentText"/>
@@ -6157,11 +6164,11 @@
       <w:r>
         <w:instrText xml:space="preserve"> HYPERLINK "mailto:pawel.kaminski@uni.lu"</w:instrText>
       </w:r>
-      <w:bookmarkStart w:id="272" w:name="_@_B51EC266FDE545FF934EE41F076A4E36Z"/>
+      <w:bookmarkStart w:id="275" w:name="_@_B51EC266FDE545FF934EE41F076A4E36Z"/>
       <w:r>
         <w:fldChar w:fldCharType="separate"/>
       </w:r>
-      <w:bookmarkEnd w:id="272"/>
+      <w:bookmarkEnd w:id="275"/>
       <w:r>
         <w:rPr>
           <w:rStyle w:val="Mention"/>
@@ -6177,7 +6184,7 @@
       </w:r>
     </w:p>
   </w:comment>
-  <w:comment w:id="271" w:author="Pawel KAMINSKI" w:date="2024-06-03T16:46:00Z" w:initials="PK">
+  <w:comment w:id="274" w:author="Pawel KAMINSKI" w:date="2024-06-03T16:46:00Z" w:initials="PK">
     <w:p>
       <w:pPr>
         <w:pStyle w:val="CommentText"/>
@@ -6193,7 +6200,7 @@
       </w:r>
     </w:p>
   </w:comment>
-  <w:comment w:id="283" w:author="Deutsch, Verena" w:date="2024-04-29T16:01:00Z" w:initials="DV">
+  <w:comment w:id="286" w:author="Deutsch, Verena" w:date="2024-04-29T16:01:00Z" w:initials="DV">
     <w:p>
       <w:pPr>
         <w:pStyle w:val="CommentText"/>
@@ -6209,7 +6216,7 @@
       </w:r>
     </w:p>
   </w:comment>
-  <w:comment w:id="284" w:author="Gabor Mihaly TOTH" w:date="2024-05-28T09:24:00Z" w:initials="GT">
+  <w:comment w:id="287" w:author="Gabor Mihaly TOTH" w:date="2024-05-28T09:24:00Z" w:initials="GT">
     <w:p>
       <w:pPr>
         <w:pStyle w:val="CommentText"/>
@@ -6226,11 +6233,11 @@
       <w:r>
         <w:instrText xml:space="preserve"> HYPERLINK "mailto:pawel.kaminski@uni.lu"</w:instrText>
       </w:r>
-      <w:bookmarkStart w:id="287" w:name="_@_DE758C3EDF78448895C4EA7BC3CD5E7FZ"/>
+      <w:bookmarkStart w:id="290" w:name="_@_DE758C3EDF78448895C4EA7BC3CD5E7FZ"/>
       <w:r>
         <w:fldChar w:fldCharType="separate"/>
       </w:r>
-      <w:bookmarkEnd w:id="287"/>
+      <w:bookmarkEnd w:id="290"/>
       <w:r>
         <w:rPr>
           <w:rStyle w:val="Mention"/>
@@ -6246,7 +6253,7 @@
       </w:r>
     </w:p>
   </w:comment>
-  <w:comment w:id="285" w:author="Pawel KAMINSKI" w:date="2024-06-03T16:58:00Z" w:initials="PK">
+  <w:comment w:id="288" w:author="Pawel KAMINSKI" w:date="2024-06-03T16:58:00Z" w:initials="PK">
     <w:p>
       <w:pPr>
         <w:pStyle w:val="CommentText"/>
@@ -6262,7 +6269,7 @@
       </w:r>
     </w:p>
   </w:comment>
-  <w:comment w:id="295" w:author="Deutsch, Verena" w:date="2024-04-29T16:02:00Z" w:initials="DV">
+  <w:comment w:id="298" w:author="Deutsch, Verena" w:date="2024-04-29T16:02:00Z" w:initials="DV">
     <w:p>
       <w:pPr>
         <w:pStyle w:val="CommentText"/>
@@ -6278,7 +6285,7 @@
       </w:r>
     </w:p>
   </w:comment>
-  <w:comment w:id="296" w:author="Gabor Mihaly TOTH" w:date="2024-05-28T09:25:00Z" w:initials="GT">
+  <w:comment w:id="299" w:author="Gabor Mihaly TOTH" w:date="2024-05-28T09:25:00Z" w:initials="GT">
     <w:p>
       <w:pPr>
         <w:pStyle w:val="CommentText"/>
@@ -6295,11 +6302,11 @@
       <w:r>
         <w:instrText xml:space="preserve"> HYPERLINK "mailto:pawel.kaminski@uni.lu"</w:instrText>
       </w:r>
-      <w:bookmarkStart w:id="300" w:name="_@_38609CA6FBEC46D499F36D380906528BZ"/>
+      <w:bookmarkStart w:id="303" w:name="_@_38609CA6FBEC46D499F36D380906528BZ"/>
       <w:r>
         <w:fldChar w:fldCharType="separate"/>
       </w:r>
-      <w:bookmarkEnd w:id="300"/>
+      <w:bookmarkEnd w:id="303"/>
       <w:r>
         <w:rPr>
           <w:rStyle w:val="Mention"/>
@@ -6315,7 +6322,7 @@
       </w:r>
     </w:p>
   </w:comment>
-  <w:comment w:id="297" w:author="Pawel KAMINSKI" w:date="2024-06-03T16:58:00Z" w:initials="PK">
+  <w:comment w:id="300" w:author="Pawel KAMINSKI" w:date="2024-06-03T16:58:00Z" w:initials="PK">
     <w:p>
       <w:pPr>
         <w:pStyle w:val="CommentText"/>

</xml_diff>